<commit_message>
v1.3.0 - WiFi file playback, unique AP SSID, unit ID on display
</commit_message>
<xml_diff>
--- a/docs/K0WLY_CW_Keyer_Manual.docx
+++ b/docs/K0WLY_CW_Keyer_Manual.docx
@@ -63,7 +63,7 @@
           <w:sz w:val="24"/>
           <w:szCs w:val="24"/>
         </w:rPr>
-        <w:t xml:space="preserve">Version 1.2</w:t>
+        <w:t xml:space="preserve">Version 1.3</w:t>
       </w:r>
     </w:p>
     <w:p>
@@ -208,27 +208,6 @@
           <w:szCs w:val="22"/>
         </w:rPr>
         <w:t xml:space="preserve">This work — including all firmware source code, schematic diagrams, PCB design files, and documentation — is licensed under the CERN Open Hardware Licence Version 2 – Weakly Reciprocal (CERN-OHL-W v2).</w:t>
-      </w:r>
-    </w:p>
-    <w:p>
-      <w:pPr>
-        <w:spacing w:after="120"/>
-      </w:pPr>
-      <w:r>
-        <w:t xml:space="preserve"/>
-      </w:r>
-    </w:p>
-    <w:p>
-      <w:pPr>
-        <w:spacing w:after="120"/>
-      </w:pPr>
-      <w:r>
-        <w:rPr>
-          <w:rFonts w:ascii="Arial" w:cs="Arial" w:eastAsia="Arial" w:hAnsi="Arial"/>
-          <w:sz w:val="22"/>
-          <w:szCs w:val="22"/>
-        </w:rPr>
-        <w:t xml:space="preserve">You may redistribute and modify this work and make products using it under the terms of the CERN-OHL-W v2 (https://ohwr.org/cern_ohl_w_v2.txt).</w:t>
       </w:r>
     </w:p>
     <w:p>
@@ -331,6 +310,94 @@
     </w:p>
     <w:p>
       <w:pPr>
+        <w:spacing w:after="120"/>
+      </w:pPr>
+      <w:r>
+        <w:t xml:space="preserve"/>
+      </w:r>
+    </w:p>
+    <w:p>
+      <w:pPr>
+        <w:pBdr>
+          <w:top w:val="single" w:color="CCCCCC" w:sz="4" w:space="1"/>
+        </w:pBdr>
+        <w:spacing w:before="480"/>
+        <w:jc w:val="center"/>
+      </w:pPr>
+      <w:r>
+        <w:rPr>
+          <w:rFonts w:ascii="Arial" w:cs="Arial" w:eastAsia="Arial" w:hAnsi="Arial"/>
+          <w:i/>
+          <w:iCs/>
+          <w:color w:val="2E4057"/>
+          <w:sz w:val="22"/>
+          <w:szCs w:val="22"/>
+        </w:rPr>
+        <w:t xml:space="preserve">73 de K0WLY</w:t>
+      </w:r>
+    </w:p>
+    <w:p>
+      <w:pPr>
+        <w:spacing w:after="120"/>
+      </w:pPr>
+      <w:r>
+        <w:t xml:space="preserve"/>
+      </w:r>
+    </w:p>
+    <w:p>
+      <w:pPr>
+        <w:pStyle w:val="Heading1"/>
+      </w:pPr>
+      <w:r>
+        <w:rPr>
+          <w:rFonts w:ascii="Arial" w:cs="Arial" w:eastAsia="Arial" w:hAnsi="Arial"/>
+          <w:b/>
+          <w:bCs/>
+          <w:color w:val="2E4057"/>
+          <w:sz w:val="32"/>
+          <w:szCs w:val="32"/>
+        </w:rPr>
+        <w:t xml:space="preserve">1. Overview</w:t>
+      </w:r>
+    </w:p>
+    <w:p>
+      <w:pPr>
+        <w:spacing w:after="120"/>
+      </w:pPr>
+      <w:r>
+        <w:rPr>
+          <w:rFonts w:ascii="Arial" w:cs="Arial" w:eastAsia="Arial" w:hAnsi="Arial"/>
+          <w:sz w:val="22"/>
+          <w:szCs w:val="22"/>
+        </w:rPr>
+        <w:t xml:space="preserve">The K0WLY Two-Way CW Keyer is an ESP32-S3 based iambic keyer built on the LilyGO T-Display S3 AMOLED board featuring a 1.91” 536×240 AMOLED display. It provides full iambic keying with sidetone, real-time Morse code decoding, radio keying output via optocoupler, peer-to-peer two-way CW communication over WiFi using ESP-NOW, and text file playback via a built-in WiFi web server.</w:t>
+      </w:r>
+    </w:p>
+    <w:p>
+      <w:pPr>
+        <w:spacing w:after="120"/>
+      </w:pPr>
+      <w:r>
+        <w:t xml:space="preserve"/>
+      </w:r>
+    </w:p>
+    <w:p>
+      <w:pPr>
+        <w:spacing w:after="120"/>
+      </w:pPr>
+      <w:r>
+        <w:rPr>
+          <w:rFonts w:ascii="Arial" w:cs="Arial" w:eastAsia="Arial" w:hAnsi="Arial"/>
+          <w:b/>
+          <w:bCs/>
+          <w:sz w:val="22"/>
+          <w:szCs w:val="22"/>
+        </w:rPr>
+        <w:t xml:space="preserve">Key features:</w:t>
+      </w:r>
+    </w:p>
+    <w:p>
+      <w:pPr>
         <w:pStyle w:val="ListParagraph"/>
         <w:numPr>
           <w:ilvl w:val="0"/>
@@ -344,95 +411,7 @@
           <w:sz w:val="22"/>
           <w:szCs w:val="22"/>
         </w:rPr>
-        <w:t xml:space="preserve">The original project source must be acknowledged in derivative documentation</w:t>
-      </w:r>
-    </w:p>
-    <w:p>
-      <w:pPr>
-        <w:spacing w:after="120"/>
-      </w:pPr>
-      <w:r>
-        <w:t xml:space="preserve"/>
-      </w:r>
-    </w:p>
-    <w:p>
-      <w:pPr>
-        <w:pBdr>
-          <w:top w:val="single" w:color="CCCCCC" w:sz="4" w:space="1"/>
-        </w:pBdr>
-        <w:spacing w:before="480"/>
-        <w:jc w:val="center"/>
-      </w:pPr>
-      <w:r>
-        <w:rPr>
-          <w:rFonts w:ascii="Arial" w:cs="Arial" w:eastAsia="Arial" w:hAnsi="Arial"/>
-          <w:i/>
-          <w:iCs/>
-          <w:color w:val="2E4057"/>
-          <w:sz w:val="22"/>
-          <w:szCs w:val="22"/>
-        </w:rPr>
-        <w:t xml:space="preserve">73 de K0WLY</w:t>
-      </w:r>
-    </w:p>
-    <w:p>
-      <w:pPr>
-        <w:spacing w:after="120"/>
-      </w:pPr>
-      <w:r>
-        <w:t xml:space="preserve"/>
-      </w:r>
-    </w:p>
-    <w:p>
-      <w:pPr>
-        <w:pStyle w:val="Heading1"/>
-      </w:pPr>
-      <w:r>
-        <w:rPr>
-          <w:rFonts w:ascii="Arial" w:cs="Arial" w:eastAsia="Arial" w:hAnsi="Arial"/>
-          <w:b/>
-          <w:bCs/>
-          <w:color w:val="2E4057"/>
-          <w:sz w:val="32"/>
-          <w:szCs w:val="32"/>
-        </w:rPr>
-        <w:t xml:space="preserve">1. Overview</w:t>
-      </w:r>
-    </w:p>
-    <w:p>
-      <w:pPr>
-        <w:spacing w:after="120"/>
-      </w:pPr>
-      <w:r>
-        <w:rPr>
-          <w:rFonts w:ascii="Arial" w:cs="Arial" w:eastAsia="Arial" w:hAnsi="Arial"/>
-          <w:sz w:val="22"/>
-          <w:szCs w:val="22"/>
-        </w:rPr>
-        <w:t xml:space="preserve">The K0WLY Two-Way CW Keyer is an ESP32-S3 based iambic keyer built on the LilyGO T-Display S3 AMOLED board featuring a 1.91” 536×240 AMOLED display. It provides full iambic keying with sidetone, real-time Morse code decoding, radio keying output via optocoupler, and peer-to-peer two-way CW communication over WiFi using ESP-NOW — no router or network infrastructure required.</w:t>
-      </w:r>
-    </w:p>
-    <w:p>
-      <w:pPr>
-        <w:spacing w:after="120"/>
-      </w:pPr>
-      <w:r>
-        <w:t xml:space="preserve"/>
-      </w:r>
-    </w:p>
-    <w:p>
-      <w:pPr>
-        <w:spacing w:after="120"/>
-      </w:pPr>
-      <w:r>
-        <w:rPr>
-          <w:rFonts w:ascii="Arial" w:cs="Arial" w:eastAsia="Arial" w:hAnsi="Arial"/>
-          <w:b/>
-          <w:bCs/>
-          <w:sz w:val="22"/>
-          <w:szCs w:val="22"/>
-        </w:rPr>
-        <w:t xml:space="preserve">Key features:</w:t>
+        <w:t xml:space="preserve">Iambic Mode A keyer with adjustable speed (5–40 WPM)</w:t>
       </w:r>
     </w:p>
     <w:p>
@@ -450,7 +429,7 @@
           <w:sz w:val="22"/>
           <w:szCs w:val="22"/>
         </w:rPr>
-        <w:t xml:space="preserve">Iambic Mode A keyer with adjustable speed (5–40 WPM)</w:t>
+        <w:t xml:space="preserve">Straight key mode selectable via hardware switch</w:t>
       </w:r>
     </w:p>
     <w:p>
@@ -468,7 +447,7 @@
           <w:sz w:val="22"/>
           <w:szCs w:val="22"/>
         </w:rPr>
-        <w:t xml:space="preserve">Straight key mode selectable via hardware switch</w:t>
+        <w:t xml:space="preserve">Radio keying output via PC817 optocoupler — fully isolated</w:t>
       </w:r>
     </w:p>
     <w:p>
@@ -486,7 +465,7 @@
           <w:sz w:val="22"/>
           <w:szCs w:val="22"/>
         </w:rPr>
-        <w:t xml:space="preserve">Farnsworth spacing — two-speed CW for learning: characters at full speed, gaps at slower effective speed (4 WPM min)</w:t>
+        <w:t xml:space="preserve">Farnsworth spacing — independent character and gap speeds</w:t>
       </w:r>
     </w:p>
     <w:p>
@@ -504,7 +483,7 @@
           <w:sz w:val="22"/>
           <w:szCs w:val="22"/>
         </w:rPr>
-        <w:t xml:space="preserve">Radio keying output via PC817 optocoupler — fully isolated, compatible with most transceivers</w:t>
+        <w:t xml:space="preserve">Adjustable sidetone frequency (400–900 Hz) — each unit independent</w:t>
       </w:r>
     </w:p>
     <w:p>
@@ -522,7 +501,7 @@
           <w:sz w:val="22"/>
           <w:szCs w:val="22"/>
         </w:rPr>
-        <w:t xml:space="preserve">Adjustable sidetone frequency (400–900 Hz) — each unit independent</w:t>
+        <w:t xml:space="preserve">Logarithmic volume control for speaker and headphones</w:t>
       </w:r>
     </w:p>
     <w:p>
@@ -540,7 +519,7 @@
           <w:sz w:val="22"/>
           <w:szCs w:val="22"/>
         </w:rPr>
-        <w:t xml:space="preserve">Logarithmic volume control for speaker and headphones</w:t>
+        <w:t xml:space="preserve">Head copy delay (0–3 seconds) or Audio Only mode</w:t>
       </w:r>
     </w:p>
     <w:p>
@@ -558,7 +537,7 @@
           <w:sz w:val="22"/>
           <w:szCs w:val="22"/>
         </w:rPr>
-        <w:t xml:space="preserve">Head copy delay (0–3 seconds) for incoming characters</w:t>
+        <w:t xml:space="preserve">Word gap spacing (off or 4–9 dits)</w:t>
       </w:r>
     </w:p>
     <w:p>
@@ -576,7 +555,43 @@
           <w:sz w:val="22"/>
           <w:szCs w:val="22"/>
         </w:rPr>
-        <w:t xml:space="preserve">Automatic peer-to-peer WiFi pairing via ESP-NOW</w:t>
+        <w:t xml:space="preserve">WiFi Access Point — unique hotspot per unit (K0WLY-XXXX), no password</w:t>
+      </w:r>
+    </w:p>
+    <w:p>
+      <w:pPr>
+        <w:pStyle w:val="ListParagraph"/>
+        <w:numPr>
+          <w:ilvl w:val="0"/>
+          <w:numId w:val="2"/>
+        </w:numPr>
+        <w:spacing w:after="80"/>
+      </w:pPr>
+      <w:r>
+        <w:rPr>
+          <w:rFonts w:ascii="Arial" w:cs="Arial" w:eastAsia="Arial" w:hAnsi="Arial"/>
+          <w:sz w:val="22"/>
+          <w:szCs w:val="22"/>
+        </w:rPr>
+        <w:t xml:space="preserve">Text file playback — upload .txt files from phone, plays as CW</w:t>
+      </w:r>
+    </w:p>
+    <w:p>
+      <w:pPr>
+        <w:pStyle w:val="ListParagraph"/>
+        <w:numPr>
+          <w:ilvl w:val="0"/>
+          <w:numId w:val="2"/>
+        </w:numPr>
+        <w:spacing w:after="80"/>
+      </w:pPr>
+      <w:r>
+        <w:rPr>
+          <w:rFonts w:ascii="Arial" w:cs="Arial" w:eastAsia="Arial" w:hAnsi="Arial"/>
+          <w:sz w:val="22"/>
+          <w:szCs w:val="22"/>
+        </w:rPr>
+        <w:t xml:space="preserve">Automatic peer-to-peer WiFi pairing via ESP-NOW — no router needed</w:t>
       </w:r>
     </w:p>
     <w:p>
@@ -916,7 +931,7 @@
                 <w:sz w:val="20"/>
                 <w:szCs w:val="20"/>
               </w:rPr>
-              <w:t xml:space="preserve">Callsign, WPM, Freq, Delay, Vol, SK/IAM, SOLO/DUAL</w:t>
+              <w:t xml:space="preserve">WPM, Freq, Delay, Vol, GAP, SK/IAM, SOLO/DUAL</w:t>
             </w:r>
           </w:p>
         </w:tc>
@@ -1201,7 +1216,7 @@
                 <w:sz w:val="20"/>
                 <w:szCs w:val="20"/>
               </w:rPr>
-              <w:t xml:space="preserve">Active pot mode, current value, peer MAC address</w:t>
+              <w:t xml:space="preserve">Pot mode, value, peer MAC, unit ID, callsign/version</w:t>
             </w:r>
           </w:p>
         </w:tc>
@@ -1259,7 +1274,7 @@
           <w:sz w:val="22"/>
           <w:szCs w:val="22"/>
         </w:rPr>
-        <w:t xml:space="preserve">K0WLY — Your callsign (left side, green)</w:t>
+        <w:t xml:space="preserve">WPM — Current speed, highlighted yellow when selected/editing</w:t>
       </w:r>
     </w:p>
     <w:p>
@@ -1277,7 +1292,7 @@
           <w:sz w:val="22"/>
           <w:szCs w:val="22"/>
         </w:rPr>
-        <w:t xml:space="preserve">WPM — Current speed, highlighted yellow when selected</w:t>
+        <w:t xml:space="preserve">Hz — Sidetone frequency, highlighted cyan when selected/editing</w:t>
       </w:r>
     </w:p>
     <w:p>
@@ -1295,7 +1310,7 @@
           <w:sz w:val="22"/>
           <w:szCs w:val="22"/>
         </w:rPr>
-        <w:t xml:space="preserve">Hz — Sidetone frequency, highlighted cyan when selected</w:t>
+        <w:t xml:space="preserve">DLY — Head copy delay or AO (Audio Only), highlighted orange</w:t>
       </w:r>
     </w:p>
     <w:p>
@@ -1313,7 +1328,7 @@
           <w:sz w:val="22"/>
           <w:szCs w:val="22"/>
         </w:rPr>
-        <w:t xml:space="preserve">DLY — Head copy delay in seconds, highlighted orange when selected</w:t>
+        <w:t xml:space="preserve">VOL — Volume percentage, highlighted magenta when selected/editing</w:t>
       </w:r>
     </w:p>
     <w:p>
@@ -1331,7 +1346,7 @@
           <w:sz w:val="22"/>
           <w:szCs w:val="22"/>
         </w:rPr>
-        <w:t xml:space="preserve">VOL — Volume percentage, highlighted magenta when selected</w:t>
+        <w:t xml:space="preserve">GAP — Word gap threshold (OFF or 4–9 dits), highlighted green</w:t>
       </w:r>
     </w:p>
     <w:p>
@@ -1380,27 +1395,6 @@
     </w:p>
     <w:p>
       <w:pPr>
-        <w:spacing w:after="120"/>
-      </w:pPr>
-      <w:r>
-        <w:rPr>
-          <w:rFonts w:ascii="Arial" w:cs="Arial" w:eastAsia="Arial" w:hAnsi="Arial"/>
-          <w:sz w:val="22"/>
-          <w:szCs w:val="22"/>
-        </w:rPr>
-        <w:t xml:space="preserve">When a parameter is selected but not in edit mode it appears in a dim version of its color. When in edit mode it brightens to full color and [EDIT] appears in the status area.</w:t>
-      </w:r>
-    </w:p>
-    <w:p>
-      <w:pPr>
-        <w:spacing w:after="120"/>
-      </w:pPr>
-      <w:r>
-        <w:t xml:space="preserve"/>
-      </w:r>
-    </w:p>
-    <w:p>
-      <w:pPr>
         <w:pStyle w:val="Heading2"/>
       </w:pPr>
       <w:r>
@@ -1425,7 +1419,44 @@
           <w:sz w:val="22"/>
           <w:szCs w:val="22"/>
         </w:rPr>
-        <w:t xml:space="preserve">Decoded characters scroll from right to left on each line. The TX line (green) shows characters you are sending. The RX line (cyan) shows characters received from the peer unit, subject to any head copy delay you have set.</w:t>
+        <w:t xml:space="preserve">The TX line (green) shows characters you are sending or playing from file. The RX line (cyan) shows characters received from the peer unit. During file playback, characters appear on the TX line as they sound — not ahead of the audio.</w:t>
+      </w:r>
+    </w:p>
+    <w:p>
+      <w:pPr>
+        <w:spacing w:after="120"/>
+      </w:pPr>
+      <w:r>
+        <w:t xml:space="preserve"/>
+      </w:r>
+    </w:p>
+    <w:p>
+      <w:pPr>
+        <w:pStyle w:val="Heading2"/>
+      </w:pPr>
+      <w:r>
+        <w:rPr>
+          <w:rFonts w:ascii="Arial" w:cs="Arial" w:eastAsia="Arial" w:hAnsi="Arial"/>
+          <w:b/>
+          <w:bCs/>
+          <w:color w:val="048A81"/>
+          <w:sz w:val="26"/>
+          <w:szCs w:val="26"/>
+        </w:rPr>
+        <w:t xml:space="preserve">2.3 Status Area</w:t>
+      </w:r>
+    </w:p>
+    <w:p>
+      <w:pPr>
+        <w:spacing w:after="120"/>
+      </w:pPr>
+      <w:r>
+        <w:rPr>
+          <w:rFonts w:ascii="Arial" w:cs="Arial" w:eastAsia="Arial" w:hAnsi="Arial"/>
+          <w:sz w:val="22"/>
+          <w:szCs w:val="22"/>
+        </w:rPr>
+        <w:t xml:space="preserve">The status area shows the active pot mode and current value. The peer MAC (or SEARCHING...) appears at bottom left. The unit ID (e.g. 4EF8) and K0WLY version appear at bottom right, making it easy to identify each unit.</w:t>
       </w:r>
     </w:p>
     <w:p>
@@ -2178,7 +2209,7 @@
                 <w:sz w:val="20"/>
                 <w:szCs w:val="20"/>
               </w:rPr>
-              <w:t xml:space="preserve">Paddle Reverse</w:t>
+              <w:t xml:space="preserve">Paddle Reverse / File</w:t>
             </w:r>
           </w:p>
         </w:tc>
@@ -2240,7 +2271,7 @@
                 <w:sz w:val="20"/>
                 <w:szCs w:val="20"/>
               </w:rPr>
-              <w:t xml:space="preserve">PBNO momentary button</w:t>
+              <w:t xml:space="preserve">PBNO: short=next file, long=play/pause</w:t>
             </w:r>
           </w:p>
         </w:tc>
@@ -2375,7 +2406,7 @@
           <w:sz w:val="22"/>
           <w:szCs w:val="22"/>
         </w:rPr>
-        <w:t xml:space="preserve">The keyer accepts a standard two-lever iambic paddle. Connect the dit lever to GPIO11 and the dah lever to GPIO10 with external 10kΩ pull-up resistors to 3.3V on each line. The paddle contacts should close to ground.</w:t>
+        <w:t xml:space="preserve">The keyer accepts a standard two-lever iambic paddle. Connect the dit lever to GPIO11 and the dah lever to GPIO10 with external 10kΩ pull-up resistors to 3.3V.</w:t>
       </w:r>
     </w:p>
     <w:p>
@@ -2410,7 +2441,7 @@
           <w:sz w:val="22"/>
           <w:szCs w:val="22"/>
         </w:rPr>
-        <w:t xml:space="preserve">If your paddle levers feel reversed, press the Paddle Reverse button (GPIO16) to swap them in software without rewiring.</w:t>
+        <w:t xml:space="preserve">If your paddle levers feel reversed, press the Paddle Reverse button (GPIO16) to swap them in software without rewiring. Note: when files are loaded, GPIO16 controls file playback instead.</w:t>
       </w:r>
     </w:p>
     <w:p>
@@ -2447,28 +2478,7 @@
           <w:sz w:val="22"/>
           <w:szCs w:val="22"/>
         </w:rPr>
-        <w:t xml:space="preserve">GPIO12 drives a PC817 optocoupler to key your transceiver. The optocoupler provides full electrical isolation between the ESP32-S3 and the radio's key line, which may carry up to 9V on some transceivers including the Kenwood TS-120S. GPIO12 goes HIGH when keying and LOW when idle.</w:t>
-      </w:r>
-    </w:p>
-    <w:p>
-      <w:pPr>
-        <w:spacing w:after="120"/>
-      </w:pPr>
-      <w:r>
-        <w:t xml:space="preserve"/>
-      </w:r>
-    </w:p>
-    <w:p>
-      <w:pPr>
-        <w:spacing w:after="120"/>
-      </w:pPr>
-      <w:r>
-        <w:rPr>
-          <w:rFonts w:ascii="Arial" w:cs="Arial" w:eastAsia="Arial" w:hAnsi="Arial"/>
-          <w:sz w:val="22"/>
-          <w:szCs w:val="22"/>
-        </w:rPr>
-        <w:t xml:space="preserve">Circuit: GPIO12 → 470Ω → PC817 LED anode / cathode → GND. PC817 collector → radio KEY tip, PC817 emitter → radio KEY sleeve (ground).</w:t>
+        <w:t xml:space="preserve">GPIO12 drives a PC817 optocoupler to key your transceiver. Provides full electrical isolation between the ESP32-S3 and the radio's key line.</w:t>
       </w:r>
     </w:p>
     <w:p>
@@ -2503,7 +2513,7 @@
           <w:sz w:val="22"/>
           <w:szCs w:val="22"/>
         </w:rPr>
-        <w:t xml:space="preserve">Never connect GPIO12 directly to a radio key line without the PC817 optocoupler. Many transceivers carry voltage on the key line that will damage the ESP32-S3.</w:t>
+        <w:t xml:space="preserve">Never connect GPIO12 directly to a radio key line without the PC817 optocoupler.</w:t>
       </w:r>
     </w:p>
     <w:p>
@@ -2537,27 +2547,6 @@
       <w:r>
         <w:rPr>
           <w:rFonts w:ascii="Arial" w:cs="Arial" w:eastAsia="Arial" w:hAnsi="Arial"/>
-          <w:sz w:val="22"/>
-          <w:szCs w:val="22"/>
-        </w:rPr>
-        <w:t xml:space="preserve">The sidetone is a PWM square wave on GPIO13 driving a 2N4401 NPN transistor. A bi-polar electrolytic coupling capacitor is used on the headphone output only.</w:t>
-      </w:r>
-    </w:p>
-    <w:p>
-      <w:pPr>
-        <w:spacing w:after="120"/>
-      </w:pPr>
-      <w:r>
-        <w:t xml:space="preserve"/>
-      </w:r>
-    </w:p>
-    <w:p>
-      <w:pPr>
-        <w:spacing w:after="120"/>
-      </w:pPr>
-      <w:r>
-        <w:rPr>
-          <w:rFonts w:ascii="Arial" w:cs="Arial" w:eastAsia="Arial" w:hAnsi="Arial"/>
           <w:b/>
           <w:bCs/>
           <w:sz w:val="22"/>
@@ -2611,7 +2600,7 @@
           <w:sz w:val="22"/>
           <w:szCs w:val="22"/>
         </w:rPr>
-        <w:t xml:space="preserve">Do NOT put a coupling capacitor in series with the speaker. It will completely block all audio. The speaker connects directly between 3.3V and the transistor collector.</w:t>
+        <w:t xml:space="preserve">Do NOT put a coupling capacitor in series with the speaker. It will completely block all audio.</w:t>
       </w:r>
     </w:p>
     <w:p>
@@ -2647,118 +2636,7 @@
           <w:sz w:val="22"/>
           <w:szCs w:val="22"/>
         </w:rPr>
-        <w:t xml:space="preserve">3.3V → 1kΩ → Collector / 2N4401 #2 (base shared) / Emitter → GND. Collector → 47µF bi-polar cap → 100Ω → 3.5mm tip. 3.5mm sleeve → GND.</w:t>
-      </w:r>
-    </w:p>
-    <w:p>
-      <w:pPr>
-        <w:spacing w:after="120"/>
-      </w:pPr>
-      <w:r>
-        <w:t xml:space="preserve"/>
-      </w:r>
-    </w:p>
-    <w:p>
-      <w:pPr>
-        <w:pStyle w:val="Heading2"/>
-      </w:pPr>
-      <w:r>
-        <w:rPr>
-          <w:rFonts w:ascii="Arial" w:cs="Arial" w:eastAsia="Arial" w:hAnsi="Arial"/>
-          <w:b/>
-          <w:bCs/>
-          <w:color w:val="048A81"/>
-          <w:sz w:val="26"/>
-          <w:szCs w:val="26"/>
-        </w:rPr>
-        <w:t xml:space="preserve">3.5 Key Mode Switch (GPIO15)</w:t>
-      </w:r>
-    </w:p>
-    <w:p>
-      <w:pPr>
-        <w:spacing w:after="120"/>
-      </w:pPr>
-      <w:r>
-        <w:rPr>
-          <w:rFonts w:ascii="Arial" w:cs="Arial" w:eastAsia="Arial" w:hAnsi="Arial"/>
-          <w:sz w:val="22"/>
-          <w:szCs w:val="22"/>
-        </w:rPr>
-        <w:t xml:space="preserve">A SPST latching switch. Open (pulled high) = iambic mode. Closed (GPIO15 to GND) = straight key mode, where the dit paddle acts as a simple key-down/key-up and the dah paddle is ignored.</w:t>
-      </w:r>
-    </w:p>
-    <w:p>
-      <w:pPr>
-        <w:spacing w:after="120"/>
-      </w:pPr>
-      <w:r>
-        <w:t xml:space="preserve"/>
-      </w:r>
-    </w:p>
-    <w:p>
-      <w:pPr>
-        <w:pStyle w:val="Heading2"/>
-      </w:pPr>
-      <w:r>
-        <w:rPr>
-          <w:rFonts w:ascii="Arial" w:cs="Arial" w:eastAsia="Arial" w:hAnsi="Arial"/>
-          <w:b/>
-          <w:bCs/>
-          <w:color w:val="048A81"/>
-          <w:sz w:val="26"/>
-          <w:szCs w:val="26"/>
-        </w:rPr>
-        <w:t xml:space="preserve">3.6 Paddle Reverse Button (GPIO16)</w:t>
-      </w:r>
-    </w:p>
-    <w:p>
-      <w:pPr>
-        <w:spacing w:after="120"/>
-      </w:pPr>
-      <w:r>
-        <w:rPr>
-          <w:rFonts w:ascii="Arial" w:cs="Arial" w:eastAsia="Arial" w:hAnsi="Arial"/>
-          <w:sz w:val="22"/>
-          <w:szCs w:val="22"/>
-        </w:rPr>
-        <w:t xml:space="preserve">A PBNO momentary pushbutton. Each press toggles the dit/dah assignment in software. Resets to normal on power cycle.</w:t>
-      </w:r>
-    </w:p>
-    <w:p>
-      <w:pPr>
-        <w:spacing w:after="120"/>
-      </w:pPr>
-      <w:r>
-        <w:t xml:space="preserve"/>
-      </w:r>
-    </w:p>
-    <w:p>
-      <w:pPr>
-        <w:pStyle w:val="Heading2"/>
-      </w:pPr>
-      <w:r>
-        <w:rPr>
-          <w:rFonts w:ascii="Arial" w:cs="Arial" w:eastAsia="Arial" w:hAnsi="Arial"/>
-          <w:b/>
-          <w:bCs/>
-          <w:color w:val="048A81"/>
-          <w:sz w:val="26"/>
-          <w:szCs w:val="26"/>
-        </w:rPr>
-        <w:t xml:space="preserve">3.7 Pot Mode Select Button (GPIO39)</w:t>
-      </w:r>
-    </w:p>
-    <w:p>
-      <w:pPr>
-        <w:spacing w:after="120"/>
-      </w:pPr>
-      <w:r>
-        <w:rPr>
-          <w:rFonts w:ascii="Arial" w:cs="Arial" w:eastAsia="Arial" w:hAnsi="Arial"/>
-          <w:sz w:val="22"/>
-          <w:szCs w:val="22"/>
-        </w:rPr>
-        <w:t xml:space="preserve">A PBNO momentary pushbutton. Short press cycles parameter modes. Long press enters/exits edit mode. See Section 4.</w:t>
+        <w:t xml:space="preserve">3.3V → 1kΩ → Collector / 2N4401 #2 (base shared) / Emitter → GND. Collector → 47µF bi-polar cap → 100Ω → 3.5mm tip. Sleeve → GND.</w:t>
       </w:r>
     </w:p>
     <w:p>
@@ -2783,27 +2661,6 @@
           <w:szCs w:val="32"/>
         </w:rPr>
         <w:t xml:space="preserve">4. Parameter Adjustment</w:t>
-      </w:r>
-    </w:p>
-    <w:p>
-      <w:pPr>
-        <w:spacing w:after="120"/>
-      </w:pPr>
-      <w:r>
-        <w:rPr>
-          <w:rFonts w:ascii="Arial" w:cs="Arial" w:eastAsia="Arial" w:hAnsi="Arial"/>
-          <w:sz w:val="22"/>
-          <w:szCs w:val="22"/>
-        </w:rPr>
-        <w:t xml:space="preserve">All four adjustable parameters are controlled by a single potentiometer. The Pot Mode Select button cycles through parameters and activates edit mode.</w:t>
-      </w:r>
-    </w:p>
-    <w:p>
-      <w:pPr>
-        <w:spacing w:after="120"/>
-      </w:pPr>
-      <w:r>
-        <w:t xml:space="preserve"/>
       </w:r>
     </w:p>
     <w:p>
@@ -3024,7 +2881,7 @@
                 <w:sz w:val="20"/>
                 <w:szCs w:val="20"/>
               </w:rPr>
-              <w:t xml:space="preserve">WPM → FREQ → DELAY → VOL → WPM</w:t>
+              <w:t xml:space="preserve">WPM → FREQ → DELAY → VOL → GAP → WPM</w:t>
             </w:r>
           </w:p>
         </w:tc>
@@ -3242,27 +3099,6 @@
           <w:szCs w:val="26"/>
         </w:rPr>
         <w:t xml:space="preserve">4.2 Edit Mode</w:t>
-      </w:r>
-    </w:p>
-    <w:p>
-      <w:pPr>
-        <w:spacing w:after="120"/>
-      </w:pPr>
-      <w:r>
-        <w:rPr>
-          <w:rFonts w:ascii="Arial" w:cs="Arial" w:eastAsia="Arial" w:hAnsi="Arial"/>
-          <w:sz w:val="22"/>
-          <w:szCs w:val="22"/>
-        </w:rPr>
-        <w:t xml:space="preserve">The pot only affects values when in edit mode, preventing accidental changes.</w:t>
-      </w:r>
-    </w:p>
-    <w:p>
-      <w:pPr>
-        <w:spacing w:after="120"/>
-      </w:pPr>
-      <w:r>
-        <w:t xml:space="preserve"/>
       </w:r>
     </w:p>
     <w:p>
@@ -3369,7 +3205,7 @@
           <w:sz w:val="22"/>
           <w:szCs w:val="22"/>
         </w:rPr>
-        <w:t xml:space="preserve">All settings save automatically to flash as you adjust. Values restore on next power cycle.</w:t>
+        <w:t xml:space="preserve">All settings save automatically to flash. Values restore on next power cycle.</w:t>
       </w:r>
     </w:p>
     <w:p>
@@ -3536,7 +3372,7 @@
                 <w:sz w:val="20"/>
                 <w:szCs w:val="20"/>
               </w:rPr>
-              <w:t xml:space="preserve">WPM</w:t>
+              <w:t xml:space="preserve">Char Speed</w:t>
             </w:r>
           </w:p>
         </w:tc>
@@ -3598,7 +3434,7 @@
                 <w:sz w:val="20"/>
                 <w:szCs w:val="20"/>
               </w:rPr>
-              <w:t xml:space="preserve">PARIS standard (1200/WPM ms per dit)</w:t>
+              <w:t xml:space="preserve">Character element speed — PARIS standard</w:t>
             </w:r>
           </w:p>
         </w:tc>
@@ -3631,7 +3467,7 @@
                 <w:sz w:val="20"/>
                 <w:szCs w:val="20"/>
               </w:rPr>
-              <w:t xml:space="preserve">Char Speed</w:t>
+              <w:t xml:space="preserve">Farnsworth</w:t>
             </w:r>
           </w:p>
         </w:tc>
@@ -3662,7 +3498,7 @@
                 <w:sz w:val="20"/>
                 <w:szCs w:val="20"/>
               </w:rPr>
-              <w:t xml:space="preserve">5 – 40 WPM</w:t>
+              <w:t xml:space="preserve">4 WPM – char speed</w:t>
             </w:r>
           </w:p>
         </w:tc>
@@ -3693,7 +3529,7 @@
                 <w:sz w:val="20"/>
                 <w:szCs w:val="20"/>
               </w:rPr>
-              <w:t xml:space="preserve">Character element speed — PARIS standard</w:t>
+              <w:t xml:space="preserve">Effective gap speed; equal to char = off</w:t>
             </w:r>
           </w:p>
         </w:tc>
@@ -3726,7 +3562,7 @@
                 <w:sz w:val="20"/>
                 <w:szCs w:val="20"/>
               </w:rPr>
-              <w:t xml:space="preserve">Farnsworth</w:t>
+              <w:t xml:space="preserve">Frequency</w:t>
             </w:r>
           </w:p>
         </w:tc>
@@ -3757,7 +3593,7 @@
                 <w:sz w:val="20"/>
                 <w:szCs w:val="20"/>
               </w:rPr>
-              <w:t xml:space="preserve">4 WPM – char speed</w:t>
+              <w:t xml:space="preserve">400 – 900 Hz</w:t>
             </w:r>
           </w:p>
         </w:tc>
@@ -3788,7 +3624,7 @@
                 <w:sz w:val="20"/>
                 <w:szCs w:val="20"/>
               </w:rPr>
-              <w:t xml:space="preserve">Effective gap speed; equal to char speed = off</w:t>
+              <w:t xml:space="preserve">Sidetone pitch, each unit independent</w:t>
             </w:r>
           </w:p>
         </w:tc>
@@ -3821,7 +3657,7 @@
                 <w:sz w:val="20"/>
                 <w:szCs w:val="20"/>
               </w:rPr>
-              <w:t xml:space="preserve">Frequency</w:t>
+              <w:t xml:space="preserve">Head Copy Delay</w:t>
             </w:r>
           </w:p>
         </w:tc>
@@ -3852,7 +3688,7 @@
                 <w:sz w:val="20"/>
                 <w:szCs w:val="20"/>
               </w:rPr>
-              <w:t xml:space="preserve">400 – 900 Hz</w:t>
+              <w:t xml:space="preserve">0.0 – 3.0 sec or AO</w:t>
             </w:r>
           </w:p>
         </w:tc>
@@ -3883,7 +3719,7 @@
                 <w:sz w:val="20"/>
                 <w:szCs w:val="20"/>
               </w:rPr>
-              <w:t xml:space="preserve">Sidetone pitch, each unit independent</w:t>
+              <w:t xml:space="preserve">Top 10% of pot = Audio Only mode</w:t>
             </w:r>
           </w:p>
         </w:tc>
@@ -3916,7 +3752,7 @@
                 <w:sz w:val="20"/>
                 <w:szCs w:val="20"/>
               </w:rPr>
-              <w:t xml:space="preserve">Head Copy Delay</w:t>
+              <w:t xml:space="preserve">Volume</w:t>
             </w:r>
           </w:p>
         </w:tc>
@@ -3947,7 +3783,7 @@
                 <w:sz w:val="20"/>
                 <w:szCs w:val="20"/>
               </w:rPr>
-              <w:t xml:space="preserve">0.0 – 3.0 sec</w:t>
+              <w:t xml:space="preserve">0 – 100%</w:t>
             </w:r>
           </w:p>
         </w:tc>
@@ -3978,7 +3814,7 @@
                 <w:sz w:val="20"/>
                 <w:szCs w:val="20"/>
               </w:rPr>
-              <w:t xml:space="preserve">Incoming char display delay, 0.1s steps</w:t>
+              <w:t xml:space="preserve">Logarithmic curve, max PWM duty 78%</w:t>
             </w:r>
           </w:p>
         </w:tc>
@@ -4011,7 +3847,7 @@
                 <w:sz w:val="20"/>
                 <w:szCs w:val="20"/>
               </w:rPr>
-              <w:t xml:space="preserve">Volume</w:t>
+              <w:t xml:space="preserve">Word Gap</w:t>
             </w:r>
           </w:p>
         </w:tc>
@@ -4042,7 +3878,7 @@
                 <w:sz w:val="20"/>
                 <w:szCs w:val="20"/>
               </w:rPr>
-              <w:t xml:space="preserve">0 – 100%</w:t>
+              <w:t xml:space="preserve">OFF or 4–9 dits</w:t>
             </w:r>
           </w:p>
         </w:tc>
@@ -4073,7 +3909,7 @@
                 <w:sz w:val="20"/>
                 <w:szCs w:val="20"/>
               </w:rPr>
-              <w:t xml:space="preserve">Logarithmic curve, max PWM duty 78%</w:t>
+              <w:t xml:space="preserve">Bottom 20% of pot = OFF</w:t>
             </w:r>
           </w:p>
         </w:tc>
@@ -4085,22 +3921,6 @@
       </w:pPr>
       <w:r>
         <w:t xml:space="preserve"/>
-      </w:r>
-    </w:p>
-    <w:p>
-      <w:pPr>
-        <w:pStyle w:val="Heading1"/>
-      </w:pPr>
-      <w:r>
-        <w:rPr>
-          <w:rFonts w:ascii="Arial" w:cs="Arial" w:eastAsia="Arial" w:hAnsi="Arial"/>
-          <w:b/>
-          <w:bCs/>
-          <w:color w:val="2E4057"/>
-          <w:sz w:val="32"/>
-          <w:szCs w:val="32"/>
-        </w:rPr>
-        <w:t xml:space="preserve">5. WiFi Peer-to-Peer Operation</w:t>
       </w:r>
     </w:p>
     <w:p>
@@ -4116,7 +3936,7 @@
           <w:sz w:val="26"/>
           <w:szCs w:val="26"/>
         </w:rPr>
-        <w:t xml:space="preserve">5.1 Auto-Discovery</w:t>
+        <w:t xml:space="preserve">4.4 Farnsworth Spacing</w:t>
       </w:r>
     </w:p>
     <w:p>
@@ -4129,7 +3949,7 @@
           <w:sz w:val="22"/>
           <w:szCs w:val="22"/>
         </w:rPr>
-        <w:t xml:space="preserve">The keyer uses ESP-NOW for direct peer-to-peer communication without a WiFi router. On power-up each unit broadcasts a discovery packet every 2 seconds. When a peer responds the header shows DUAL in green and the peer MAC appears in the status area.</w:t>
+        <w:t xml:space="preserve">Farnsworth spacing sends characters at full character speed but stretches the gaps to a slower effective speed. Trains your ear to recognize whole characters at real speeds.</w:t>
       </w:r>
     </w:p>
     <w:p>
@@ -4138,184 +3958,6 @@
       </w:pPr>
       <w:r>
         <w:t xml:space="preserve"/>
-      </w:r>
-    </w:p>
-    <w:p>
-      <w:pPr>
-        <w:pStyle w:val="Heading2"/>
-      </w:pPr>
-      <w:r>
-        <w:rPr>
-          <w:rFonts w:ascii="Arial" w:cs="Arial" w:eastAsia="Arial" w:hAnsi="Arial"/>
-          <w:b/>
-          <w:bCs/>
-          <w:color w:val="048A81"/>
-          <w:sz w:val="26"/>
-          <w:szCs w:val="26"/>
-        </w:rPr>
-        <w:t xml:space="preserve">5.2 Transmitting to Peer</w:t>
-      </w:r>
-    </w:p>
-    <w:p>
-      <w:pPr>
-        <w:spacing w:after="120"/>
-      </w:pPr>
-      <w:r>
-        <w:rPr>
-          <w:rFonts w:ascii="Arial" w:cs="Arial" w:eastAsia="Arial" w:hAnsi="Arial"/>
-          <w:sz w:val="22"/>
-          <w:szCs w:val="22"/>
-        </w:rPr>
-        <w:t xml:space="preserve">Every element keyed (dit or dah) transmits to the peer unit in real time. The peer plays back each element at its own locally set sidetone frequency. Each operator always hears code at their own preferred pitch, completely independent of the other station's setting. Decoded characters also transmit and appear on the peer's RX line.</w:t>
-      </w:r>
-    </w:p>
-    <w:p>
-      <w:pPr>
-        <w:spacing w:after="120"/>
-      </w:pPr>
-      <w:r>
-        <w:t xml:space="preserve"/>
-      </w:r>
-    </w:p>
-    <w:p>
-      <w:pPr>
-        <w:pStyle w:val="Heading2"/>
-      </w:pPr>
-      <w:r>
-        <w:rPr>
-          <w:rFonts w:ascii="Arial" w:cs="Arial" w:eastAsia="Arial" w:hAnsi="Arial"/>
-          <w:b/>
-          <w:bCs/>
-          <w:color w:val="048A81"/>
-          <w:sz w:val="26"/>
-          <w:szCs w:val="26"/>
-        </w:rPr>
-        <w:t xml:space="preserve">5.3 Independent Sidetone Frequency</w:t>
-      </w:r>
-    </w:p>
-    <w:p>
-      <w:pPr>
-        <w:spacing w:after="120"/>
-      </w:pPr>
-      <w:r>
-        <w:rPr>
-          <w:rFonts w:ascii="Arial" w:cs="Arial" w:eastAsia="Arial" w:hAnsi="Arial"/>
-          <w:sz w:val="22"/>
-          <w:szCs w:val="22"/>
-        </w:rPr>
-        <w:t xml:space="preserve">Each unit plays all CW — both sent and received — at its own locally configured sidetone frequency. If one unit is set to 550 Hz and the other to 700 Hz, each operator hears everything at their own pitch. This is exactly how real CW operation works — each operator sets their sidetone to their personal preference, independent of the other station.</w:t>
-      </w:r>
-    </w:p>
-    <w:p>
-      <w:pPr>
-        <w:spacing w:after="120"/>
-      </w:pPr>
-      <w:r>
-        <w:t xml:space="preserve"/>
-      </w:r>
-    </w:p>
-    <w:p>
-      <w:pPr>
-        <w:pStyle w:val="Heading2"/>
-      </w:pPr>
-      <w:r>
-        <w:rPr>
-          <w:rFonts w:ascii="Arial" w:cs="Arial" w:eastAsia="Arial" w:hAnsi="Arial"/>
-          <w:b/>
-          <w:bCs/>
-          <w:color w:val="048A81"/>
-          <w:sz w:val="26"/>
-          <w:szCs w:val="26"/>
-        </w:rPr>
-        <w:t xml:space="preserve">5.4 Head Copy Delay</w:t>
-      </w:r>
-    </w:p>
-    <w:p>
-      <w:pPr>
-        <w:spacing w:after="120"/>
-      </w:pPr>
-      <w:r>
-        <w:rPr>
-          <w:rFonts w:ascii="Arial" w:cs="Arial" w:eastAsia="Arial" w:hAnsi="Arial"/>
-          <w:sz w:val="22"/>
-          <w:szCs w:val="22"/>
-        </w:rPr>
-        <w:t xml:space="preserve">The head copy delay applies only to the display of incoming decoded characters. Audio playback of incoming elements is always immediate. This lets you practice mentally decoding received code before the character appears on screen.</w:t>
-      </w:r>
-    </w:p>
-    <w:p>
-      <w:pPr>
-        <w:spacing w:after="120"/>
-      </w:pPr>
-      <w:r>
-        <w:t xml:space="preserve"/>
-      </w:r>
-    </w:p>
-    <w:p>
-      <w:pPr>
-        <w:spacing w:after="80" w:before="80"/>
-        <w:ind w:left="360"/>
-      </w:pPr>
-      <w:r>
-        <w:rPr>
-          <w:rFonts w:ascii="Arial" w:cs="Arial" w:eastAsia="Arial" w:hAnsi="Arial"/>
-          <w:b/>
-          <w:bCs/>
-          <w:color w:val="C0392B"/>
-          <w:sz w:val="22"/>
-          <w:szCs w:val="22"/>
-        </w:rPr>
-        <w:t xml:space="preserve">NOTE: </w:t>
-      </w:r>
-      <w:r>
-        <w:rPr>
-          <w:rFonts w:ascii="Arial" w:cs="Arial" w:eastAsia="Arial" w:hAnsi="Arial"/>
-          <w:i/>
-          <w:iCs/>
-          <w:sz w:val="22"/>
-          <w:szCs w:val="22"/>
-        </w:rPr>
-        <w:t xml:space="preserve">Set delay to 0 for normal operation. Increase gradually as your head copy skill improves.</w:t>
-      </w:r>
-    </w:p>
-    <w:p>
-      <w:pPr>
-        <w:spacing w:after="120"/>
-      </w:pPr>
-      <w:r>
-        <w:t xml:space="preserve"/>
-      </w:r>
-    </w:p>
-    <w:p>
-      <w:pPr>
-        <w:pStyle w:val="Heading1"/>
-      </w:pPr>
-      <w:r>
-        <w:rPr>
-          <w:rFonts w:ascii="Arial" w:cs="Arial" w:eastAsia="Arial" w:hAnsi="Arial"/>
-          <w:b/>
-          <w:bCs/>
-          <w:color w:val="2E4057"/>
-          <w:sz w:val="32"/>
-          <w:szCs w:val="32"/>
-        </w:rPr>
-        <w:t xml:space="preserve">6. Operating Tips</w:t>
-      </w:r>
-    </w:p>
-    <w:p>
-      <w:pPr>
-        <w:pStyle w:val="Heading2"/>
-      </w:pPr>
-      <w:r>
-        <w:rPr>
-          <w:rFonts w:ascii="Arial" w:cs="Arial" w:eastAsia="Arial" w:hAnsi="Arial"/>
-          <w:b/>
-          <w:bCs/>
-          <w:color w:val="048A81"/>
-          <w:sz w:val="26"/>
-          <w:szCs w:val="26"/>
-        </w:rPr>
-        <w:t xml:space="preserve">6.1 Getting Started</w:t>
       </w:r>
     </w:p>
     <w:p>
@@ -4333,7 +3975,7 @@
           <w:sz w:val="22"/>
           <w:szCs w:val="22"/>
         </w:rPr>
-        <w:t xml:space="preserve">Power on both units and wait approximately 5 seconds for WiFi to initialize</w:t>
+        <w:t xml:space="preserve">Long press on WPM — status shows CHAR SPEED, set character rate</w:t>
       </w:r>
     </w:p>
     <w:p>
@@ -4351,7 +3993,7 @@
           <w:sz w:val="22"/>
           <w:szCs w:val="22"/>
         </w:rPr>
-        <w:t xml:space="preserve">Verify header shows desired WPM before keying</w:t>
+        <w:t xml:space="preserve">Short press — advances to FARNSWORTH step</w:t>
       </w:r>
     </w:p>
     <w:p>
@@ -4369,7 +4011,7 @@
           <w:sz w:val="22"/>
           <w:szCs w:val="22"/>
         </w:rPr>
-        <w:t xml:space="preserve">SOLO = no peer found yet, DUAL = paired and ready</w:t>
+        <w:t xml:space="preserve">Set effective speed (4 WPM min, capped at char speed)</w:t>
       </w:r>
     </w:p>
     <w:p>
@@ -4387,7 +4029,338 @@
           <w:sz w:val="22"/>
           <w:szCs w:val="22"/>
         </w:rPr>
-        <w:t xml:space="preserve">TX line (green) shows your outgoing characters</w:t>
+        <w:t xml:space="preserve">Short press to exit. Header shows 25WPM (equal) or 25/8 (Farnsworth active)</w:t>
+      </w:r>
+    </w:p>
+    <w:p>
+      <w:pPr>
+        <w:spacing w:after="120"/>
+      </w:pPr>
+      <w:r>
+        <w:t xml:space="preserve"/>
+      </w:r>
+    </w:p>
+    <w:p>
+      <w:pPr>
+        <w:pStyle w:val="Heading2"/>
+      </w:pPr>
+      <w:r>
+        <w:rPr>
+          <w:rFonts w:ascii="Arial" w:cs="Arial" w:eastAsia="Arial" w:hAnsi="Arial"/>
+          <w:b/>
+          <w:bCs/>
+          <w:color w:val="048A81"/>
+          <w:sz w:val="26"/>
+          <w:szCs w:val="26"/>
+        </w:rPr>
+        <w:t xml:space="preserve">4.5 Audio Only Mode</w:t>
+      </w:r>
+    </w:p>
+    <w:p>
+      <w:pPr>
+        <w:spacing w:after="120"/>
+      </w:pPr>
+      <w:r>
+        <w:rPr>
+          <w:rFonts w:ascii="Arial" w:cs="Arial" w:eastAsia="Arial" w:hAnsi="Arial"/>
+          <w:sz w:val="22"/>
+          <w:szCs w:val="22"/>
+        </w:rPr>
+        <w:t xml:space="preserve">Turn the DELAY pot to the top 10% of its range to enable Audio Only mode. Header shows DLY:AO. Incoming CW audio plays normally but no characters appear on the RX line. Perfect for pure audible head copy practice with no visual crutch.</w:t>
+      </w:r>
+    </w:p>
+    <w:p>
+      <w:pPr>
+        <w:spacing w:after="120"/>
+      </w:pPr>
+      <w:r>
+        <w:t xml:space="preserve"/>
+      </w:r>
+    </w:p>
+    <w:p>
+      <w:pPr>
+        <w:pStyle w:val="Heading2"/>
+      </w:pPr>
+      <w:r>
+        <w:rPr>
+          <w:rFonts w:ascii="Arial" w:cs="Arial" w:eastAsia="Arial" w:hAnsi="Arial"/>
+          <w:b/>
+          <w:bCs/>
+          <w:color w:val="048A81"/>
+          <w:sz w:val="26"/>
+          <w:szCs w:val="26"/>
+        </w:rPr>
+        <w:t xml:space="preserve">4.6 Word Gap Setting</w:t>
+      </w:r>
+    </w:p>
+    <w:p>
+      <w:pPr>
+        <w:spacing w:after="120"/>
+      </w:pPr>
+      <w:r>
+        <w:rPr>
+          <w:rFonts w:ascii="Arial" w:cs="Arial" w:eastAsia="Arial" w:hAnsi="Arial"/>
+          <w:sz w:val="22"/>
+          <w:szCs w:val="22"/>
+        </w:rPr>
+        <w:t xml:space="preserve">When enabled, the keyer inserts spaces between words on the TX and RX lines. Bottom 20% of pot = OFF, remainder maps to 4–9 dit threshold. The gap scales proportionally with Farnsworth effective speed.</w:t>
+      </w:r>
+    </w:p>
+    <w:p>
+      <w:pPr>
+        <w:spacing w:after="120"/>
+      </w:pPr>
+      <w:r>
+        <w:t xml:space="preserve"/>
+      </w:r>
+    </w:p>
+    <w:p>
+      <w:pPr>
+        <w:pStyle w:val="Heading1"/>
+      </w:pPr>
+      <w:r>
+        <w:rPr>
+          <w:rFonts w:ascii="Arial" w:cs="Arial" w:eastAsia="Arial" w:hAnsi="Arial"/>
+          <w:b/>
+          <w:bCs/>
+          <w:color w:val="2E4057"/>
+          <w:sz w:val="32"/>
+          <w:szCs w:val="32"/>
+        </w:rPr>
+        <w:t xml:space="preserve">5. WiFi Operation</w:t>
+      </w:r>
+    </w:p>
+    <w:p>
+      <w:pPr>
+        <w:pStyle w:val="Heading2"/>
+      </w:pPr>
+      <w:r>
+        <w:rPr>
+          <w:rFonts w:ascii="Arial" w:cs="Arial" w:eastAsia="Arial" w:hAnsi="Arial"/>
+          <w:b/>
+          <w:bCs/>
+          <w:color w:val="048A81"/>
+          <w:sz w:val="26"/>
+          <w:szCs w:val="26"/>
+        </w:rPr>
+        <w:t xml:space="preserve">5.1 Peer-to-Peer Auto-Discovery</w:t>
+      </w:r>
+    </w:p>
+    <w:p>
+      <w:pPr>
+        <w:spacing w:after="120"/>
+      </w:pPr>
+      <w:r>
+        <w:rPr>
+          <w:rFonts w:ascii="Arial" w:cs="Arial" w:eastAsia="Arial" w:hAnsi="Arial"/>
+          <w:sz w:val="22"/>
+          <w:szCs w:val="22"/>
+        </w:rPr>
+        <w:t xml:space="preserve">Each unit broadcasts a discovery packet every 2 seconds. When a peer responds the header shows DUAL in green and the peer MAC appears in the status area. ESP-NOW operates on channel 1.</w:t>
+      </w:r>
+    </w:p>
+    <w:p>
+      <w:pPr>
+        <w:spacing w:after="120"/>
+      </w:pPr>
+      <w:r>
+        <w:t xml:space="preserve"/>
+      </w:r>
+    </w:p>
+    <w:p>
+      <w:pPr>
+        <w:pStyle w:val="Heading2"/>
+      </w:pPr>
+      <w:r>
+        <w:rPr>
+          <w:rFonts w:ascii="Arial" w:cs="Arial" w:eastAsia="Arial" w:hAnsi="Arial"/>
+          <w:b/>
+          <w:bCs/>
+          <w:color w:val="048A81"/>
+          <w:sz w:val="26"/>
+          <w:szCs w:val="26"/>
+        </w:rPr>
+        <w:t xml:space="preserve">5.2 Two-Way CW</w:t>
+      </w:r>
+    </w:p>
+    <w:p>
+      <w:pPr>
+        <w:spacing w:after="120"/>
+      </w:pPr>
+      <w:r>
+        <w:rPr>
+          <w:rFonts w:ascii="Arial" w:cs="Arial" w:eastAsia="Arial" w:hAnsi="Arial"/>
+          <w:sz w:val="22"/>
+          <w:szCs w:val="22"/>
+        </w:rPr>
+        <w:t xml:space="preserve">Every element keyed transmits to the peer unit in real time. The peer plays back each element at its own locally set sidetone frequency. Decoded characters also transmit and appear on the peer's RX line.</w:t>
+      </w:r>
+    </w:p>
+    <w:p>
+      <w:pPr>
+        <w:spacing w:after="120"/>
+      </w:pPr>
+      <w:r>
+        <w:t xml:space="preserve"/>
+      </w:r>
+    </w:p>
+    <w:p>
+      <w:pPr>
+        <w:pStyle w:val="Heading2"/>
+      </w:pPr>
+      <w:r>
+        <w:rPr>
+          <w:rFonts w:ascii="Arial" w:cs="Arial" w:eastAsia="Arial" w:hAnsi="Arial"/>
+          <w:b/>
+          <w:bCs/>
+          <w:color w:val="048A81"/>
+          <w:sz w:val="26"/>
+          <w:szCs w:val="26"/>
+        </w:rPr>
+        <w:t xml:space="preserve">5.3 Independent Sidetone Frequency</w:t>
+      </w:r>
+    </w:p>
+    <w:p>
+      <w:pPr>
+        <w:spacing w:after="120"/>
+      </w:pPr>
+      <w:r>
+        <w:rPr>
+          <w:rFonts w:ascii="Arial" w:cs="Arial" w:eastAsia="Arial" w:hAnsi="Arial"/>
+          <w:sz w:val="22"/>
+          <w:szCs w:val="22"/>
+        </w:rPr>
+        <w:t xml:space="preserve">Each unit plays all CW at its own locally configured frequency. If one unit is set to 550 Hz and the other to 700 Hz, each operator hears everything at their own pitch — just like real CW operation.</w:t>
+      </w:r>
+    </w:p>
+    <w:p>
+      <w:pPr>
+        <w:spacing w:after="120"/>
+      </w:pPr>
+      <w:r>
+        <w:t xml:space="preserve"/>
+      </w:r>
+    </w:p>
+    <w:p>
+      <w:pPr>
+        <w:pStyle w:val="Heading2"/>
+      </w:pPr>
+      <w:r>
+        <w:rPr>
+          <w:rFonts w:ascii="Arial" w:cs="Arial" w:eastAsia="Arial" w:hAnsi="Arial"/>
+          <w:b/>
+          <w:bCs/>
+          <w:color w:val="048A81"/>
+          <w:sz w:val="26"/>
+          <w:szCs w:val="26"/>
+        </w:rPr>
+        <w:t xml:space="preserve">5.4 Head Copy Delay</w:t>
+      </w:r>
+    </w:p>
+    <w:p>
+      <w:pPr>
+        <w:spacing w:after="120"/>
+      </w:pPr>
+      <w:r>
+        <w:rPr>
+          <w:rFonts w:ascii="Arial" w:cs="Arial" w:eastAsia="Arial" w:hAnsi="Arial"/>
+          <w:sz w:val="22"/>
+          <w:szCs w:val="22"/>
+        </w:rPr>
+        <w:t xml:space="preserve">The head copy delay applies only to the display of incoming decoded characters. Audio playback is always immediate. Practice mentally decoding before the character appears to confirm.</w:t>
+      </w:r>
+    </w:p>
+    <w:p>
+      <w:pPr>
+        <w:spacing w:after="120"/>
+      </w:pPr>
+      <w:r>
+        <w:t xml:space="preserve"/>
+      </w:r>
+    </w:p>
+    <w:p>
+      <w:pPr>
+        <w:spacing w:after="80" w:before="80"/>
+        <w:ind w:left="360"/>
+      </w:pPr>
+      <w:r>
+        <w:rPr>
+          <w:rFonts w:ascii="Arial" w:cs="Arial" w:eastAsia="Arial" w:hAnsi="Arial"/>
+          <w:b/>
+          <w:bCs/>
+          <w:color w:val="C0392B"/>
+          <w:sz w:val="22"/>
+          <w:szCs w:val="22"/>
+        </w:rPr>
+        <w:t xml:space="preserve">NOTE: </w:t>
+      </w:r>
+      <w:r>
+        <w:rPr>
+          <w:rFonts w:ascii="Arial" w:cs="Arial" w:eastAsia="Arial" w:hAnsi="Arial"/>
+          <w:i/>
+          <w:iCs/>
+          <w:sz w:val="22"/>
+          <w:szCs w:val="22"/>
+        </w:rPr>
+        <w:t xml:space="preserve">Set delay to 0 for normal operation. Increase gradually as your head copy skill improves.</w:t>
+      </w:r>
+    </w:p>
+    <w:p>
+      <w:pPr>
+        <w:spacing w:after="120"/>
+      </w:pPr>
+      <w:r>
+        <w:t xml:space="preserve"/>
+      </w:r>
+    </w:p>
+    <w:p>
+      <w:pPr>
+        <w:pStyle w:val="Heading2"/>
+      </w:pPr>
+      <w:r>
+        <w:rPr>
+          <w:rFonts w:ascii="Arial" w:cs="Arial" w:eastAsia="Arial" w:hAnsi="Arial"/>
+          <w:b/>
+          <w:bCs/>
+          <w:color w:val="048A81"/>
+          <w:sz w:val="26"/>
+          <w:szCs w:val="26"/>
+        </w:rPr>
+        <w:t xml:space="preserve">5.5 WiFi File Playback</w:t>
+      </w:r>
+    </w:p>
+    <w:p>
+      <w:pPr>
+        <w:spacing w:after="120"/>
+      </w:pPr>
+      <w:r>
+        <w:rPr>
+          <w:rFonts w:ascii="Arial" w:cs="Arial" w:eastAsia="Arial" w:hAnsi="Arial"/>
+          <w:sz w:val="22"/>
+          <w:szCs w:val="22"/>
+        </w:rPr>
+        <w:t xml:space="preserve">Each unit creates a unique WiFi hotspot named K0WLY-XXXX (where XXXX matches the unit ID shown on screen). Connect any phone, tablet, or computer — no password required — and browse to http://192.168.4.1.</w:t>
+      </w:r>
+    </w:p>
+    <w:p>
+      <w:pPr>
+        <w:spacing w:after="120"/>
+      </w:pPr>
+      <w:r>
+        <w:t xml:space="preserve"/>
+      </w:r>
+    </w:p>
+    <w:p>
+      <w:pPr>
+        <w:spacing w:after="120"/>
+      </w:pPr>
+      <w:r>
+        <w:rPr>
+          <w:rFonts w:ascii="Arial" w:cs="Arial" w:eastAsia="Arial" w:hAnsi="Arial"/>
+          <w:sz w:val="22"/>
+          <w:szCs w:val="22"/>
+        </w:rPr>
+        <w:t xml:space="preserve">From the web page you can:</w:t>
       </w:r>
     </w:p>
     <w:p>
@@ -4405,7 +4378,337 @@
           <w:sz w:val="22"/>
           <w:szCs w:val="22"/>
         </w:rPr>
-        <w:t xml:space="preserve">RX line (cyan) shows incoming characters from peer</w:t>
+        <w:t xml:space="preserve">Upload .txt text files from your device</w:t>
+      </w:r>
+    </w:p>
+    <w:p>
+      <w:pPr>
+        <w:pStyle w:val="ListParagraph"/>
+        <w:numPr>
+          <w:ilvl w:val="0"/>
+          <w:numId w:val="2"/>
+        </w:numPr>
+        <w:spacing w:after="80"/>
+      </w:pPr>
+      <w:r>
+        <w:rPr>
+          <w:rFonts w:ascii="Arial" w:cs="Arial" w:eastAsia="Arial" w:hAnsi="Arial"/>
+          <w:sz w:val="22"/>
+          <w:szCs w:val="22"/>
+        </w:rPr>
+        <w:t xml:space="preserve">See all files stored on the keyer</w:t>
+      </w:r>
+    </w:p>
+    <w:p>
+      <w:pPr>
+        <w:pStyle w:val="ListParagraph"/>
+        <w:numPr>
+          <w:ilvl w:val="0"/>
+          <w:numId w:val="2"/>
+        </w:numPr>
+        <w:spacing w:after="80"/>
+      </w:pPr>
+      <w:r>
+        <w:rPr>
+          <w:rFonts w:ascii="Arial" w:cs="Arial" w:eastAsia="Arial" w:hAnsi="Arial"/>
+          <w:sz w:val="22"/>
+          <w:szCs w:val="22"/>
+        </w:rPr>
+        <w:t xml:space="preserve">Tap Play to start a file playing as CW</w:t>
+      </w:r>
+    </w:p>
+    <w:p>
+      <w:pPr>
+        <w:pStyle w:val="ListParagraph"/>
+        <w:numPr>
+          <w:ilvl w:val="0"/>
+          <w:numId w:val="2"/>
+        </w:numPr>
+        <w:spacing w:after="80"/>
+      </w:pPr>
+      <w:r>
+        <w:rPr>
+          <w:rFonts w:ascii="Arial" w:cs="Arial" w:eastAsia="Arial" w:hAnsi="Arial"/>
+          <w:sz w:val="22"/>
+          <w:szCs w:val="22"/>
+        </w:rPr>
+        <w:t xml:space="preserve">Delete files you no longer need</w:t>
+      </w:r>
+    </w:p>
+    <w:p>
+      <w:pPr>
+        <w:pStyle w:val="ListParagraph"/>
+        <w:numPr>
+          <w:ilvl w:val="0"/>
+          <w:numId w:val="2"/>
+        </w:numPr>
+        <w:spacing w:after="80"/>
+      </w:pPr>
+      <w:r>
+        <w:rPr>
+          <w:rFonts w:ascii="Arial" w:cs="Arial" w:eastAsia="Arial" w:hAnsi="Arial"/>
+          <w:sz w:val="22"/>
+          <w:szCs w:val="22"/>
+        </w:rPr>
+        <w:t xml:space="preserve">Stop playback at any time</w:t>
+      </w:r>
+    </w:p>
+    <w:p>
+      <w:pPr>
+        <w:spacing w:after="120"/>
+      </w:pPr>
+      <w:r>
+        <w:t xml:space="preserve"/>
+      </w:r>
+    </w:p>
+    <w:p>
+      <w:pPr>
+        <w:spacing w:after="120"/>
+      </w:pPr>
+      <w:r>
+        <w:rPr>
+          <w:rFonts w:ascii="Arial" w:cs="Arial" w:eastAsia="Arial" w:hAnsi="Arial"/>
+          <w:sz w:val="22"/>
+          <w:szCs w:val="22"/>
+        </w:rPr>
+        <w:t xml:space="preserve">File playback behavior:</w:t>
+      </w:r>
+    </w:p>
+    <w:p>
+      <w:pPr>
+        <w:pStyle w:val="ListParagraph"/>
+        <w:numPr>
+          <w:ilvl w:val="0"/>
+          <w:numId w:val="2"/>
+        </w:numPr>
+        <w:spacing w:after="80"/>
+      </w:pPr>
+      <w:r>
+        <w:rPr>
+          <w:rFonts w:ascii="Arial" w:cs="Arial" w:eastAsia="Arial" w:hAnsi="Arial"/>
+          <w:sz w:val="22"/>
+          <w:szCs w:val="22"/>
+        </w:rPr>
+        <w:t xml:space="preserve">TX line clears when a new file starts — clean fresh start each time</w:t>
+      </w:r>
+    </w:p>
+    <w:p>
+      <w:pPr>
+        <w:pStyle w:val="ListParagraph"/>
+        <w:numPr>
+          <w:ilvl w:val="0"/>
+          <w:numId w:val="2"/>
+        </w:numPr>
+        <w:spacing w:after="80"/>
+      </w:pPr>
+      <w:r>
+        <w:rPr>
+          <w:rFonts w:ascii="Arial" w:cs="Arial" w:eastAsia="Arial" w:hAnsi="Arial"/>
+          <w:sz w:val="22"/>
+          <w:szCs w:val="22"/>
+        </w:rPr>
+        <w:t xml:space="preserve">Characters appear on TX line as they sound — not ahead of audio</w:t>
+      </w:r>
+    </w:p>
+    <w:p>
+      <w:pPr>
+        <w:pStyle w:val="ListParagraph"/>
+        <w:numPr>
+          <w:ilvl w:val="0"/>
+          <w:numId w:val="2"/>
+        </w:numPr>
+        <w:spacing w:after="80"/>
+      </w:pPr>
+      <w:r>
+        <w:rPr>
+          <w:rFonts w:ascii="Arial" w:cs="Arial" w:eastAsia="Arial" w:hAnsi="Arial"/>
+          <w:sz w:val="22"/>
+          <w:szCs w:val="22"/>
+        </w:rPr>
+        <w:t xml:space="preserve">Word spaces appear on screen when the silence plays</w:t>
+      </w:r>
+    </w:p>
+    <w:p>
+      <w:pPr>
+        <w:pStyle w:val="ListParagraph"/>
+        <w:numPr>
+          <w:ilvl w:val="0"/>
+          <w:numId w:val="2"/>
+        </w:numPr>
+        <w:spacing w:after="80"/>
+      </w:pPr>
+      <w:r>
+        <w:rPr>
+          <w:rFonts w:ascii="Arial" w:cs="Arial" w:eastAsia="Arial" w:hAnsi="Arial"/>
+          <w:sz w:val="22"/>
+          <w:szCs w:val="22"/>
+        </w:rPr>
+        <w:t xml:space="preserve">GPIO16 long press — play/pause current file</w:t>
+      </w:r>
+    </w:p>
+    <w:p>
+      <w:pPr>
+        <w:pStyle w:val="ListParagraph"/>
+        <w:numPr>
+          <w:ilvl w:val="0"/>
+          <w:numId w:val="2"/>
+        </w:numPr>
+        <w:spacing w:after="80"/>
+      </w:pPr>
+      <w:r>
+        <w:rPr>
+          <w:rFonts w:ascii="Arial" w:cs="Arial" w:eastAsia="Arial" w:hAnsi="Arial"/>
+          <w:sz w:val="22"/>
+          <w:szCs w:val="22"/>
+        </w:rPr>
+        <w:t xml:space="preserve">GPIO16 short press — cycle to next file (multiple files)</w:t>
+      </w:r>
+    </w:p>
+    <w:p>
+      <w:pPr>
+        <w:spacing w:after="120"/>
+      </w:pPr>
+      <w:r>
+        <w:t xml:space="preserve"/>
+      </w:r>
+    </w:p>
+    <w:p>
+      <w:pPr>
+        <w:spacing w:after="80" w:before="80"/>
+        <w:ind w:left="360"/>
+      </w:pPr>
+      <w:r>
+        <w:rPr>
+          <w:rFonts w:ascii="Arial" w:cs="Arial" w:eastAsia="Arial" w:hAnsi="Arial"/>
+          <w:b/>
+          <w:bCs/>
+          <w:color w:val="C0392B"/>
+          <w:sz w:val="22"/>
+          <w:szCs w:val="22"/>
+        </w:rPr>
+        <w:t xml:space="preserve">NOTE: </w:t>
+      </w:r>
+      <w:r>
+        <w:rPr>
+          <w:rFonts w:ascii="Arial" w:cs="Arial" w:eastAsia="Arial" w:hAnsi="Arial"/>
+          <w:i/>
+          <w:iCs/>
+          <w:sz w:val="22"/>
+          <w:szCs w:val="22"/>
+        </w:rPr>
+        <w:t xml:space="preserve">The unit ID shown on the status area matches the WiFi hotspot name, making it easy to identify which unit to connect to when multiple units are in range.</w:t>
+      </w:r>
+    </w:p>
+    <w:p>
+      <w:pPr>
+        <w:spacing w:after="120"/>
+      </w:pPr>
+      <w:r>
+        <w:t xml:space="preserve"/>
+      </w:r>
+    </w:p>
+    <w:p>
+      <w:pPr>
+        <w:pStyle w:val="Heading1"/>
+      </w:pPr>
+      <w:r>
+        <w:rPr>
+          <w:rFonts w:ascii="Arial" w:cs="Arial" w:eastAsia="Arial" w:hAnsi="Arial"/>
+          <w:b/>
+          <w:bCs/>
+          <w:color w:val="2E4057"/>
+          <w:sz w:val="32"/>
+          <w:szCs w:val="32"/>
+        </w:rPr>
+        <w:t xml:space="preserve">6. Operating Tips</w:t>
+      </w:r>
+    </w:p>
+    <w:p>
+      <w:pPr>
+        <w:pStyle w:val="Heading2"/>
+      </w:pPr>
+      <w:r>
+        <w:rPr>
+          <w:rFonts w:ascii="Arial" w:cs="Arial" w:eastAsia="Arial" w:hAnsi="Arial"/>
+          <w:b/>
+          <w:bCs/>
+          <w:color w:val="048A81"/>
+          <w:sz w:val="26"/>
+          <w:szCs w:val="26"/>
+        </w:rPr>
+        <w:t xml:space="preserve">6.1 Getting Started</w:t>
+      </w:r>
+    </w:p>
+    <w:p>
+      <w:pPr>
+        <w:pStyle w:val="ListParagraph"/>
+        <w:numPr>
+          <w:ilvl w:val="0"/>
+          <w:numId w:val="2"/>
+        </w:numPr>
+        <w:spacing w:after="80"/>
+      </w:pPr>
+      <w:r>
+        <w:rPr>
+          <w:rFonts w:ascii="Arial" w:cs="Arial" w:eastAsia="Arial" w:hAnsi="Arial"/>
+          <w:sz w:val="22"/>
+          <w:szCs w:val="22"/>
+        </w:rPr>
+        <w:t xml:space="preserve">Power on both units and wait approximately 5 seconds for WiFi to initialize</w:t>
+      </w:r>
+    </w:p>
+    <w:p>
+      <w:pPr>
+        <w:pStyle w:val="ListParagraph"/>
+        <w:numPr>
+          <w:ilvl w:val="0"/>
+          <w:numId w:val="2"/>
+        </w:numPr>
+        <w:spacing w:after="80"/>
+      </w:pPr>
+      <w:r>
+        <w:rPr>
+          <w:rFonts w:ascii="Arial" w:cs="Arial" w:eastAsia="Arial" w:hAnsi="Arial"/>
+          <w:sz w:val="22"/>
+          <w:szCs w:val="22"/>
+        </w:rPr>
+        <w:t xml:space="preserve">Each unit creates its own WiFi hotspot (K0WLY-XXXX) visible on your phone</w:t>
+      </w:r>
+    </w:p>
+    <w:p>
+      <w:pPr>
+        <w:pStyle w:val="ListParagraph"/>
+        <w:numPr>
+          <w:ilvl w:val="0"/>
+          <w:numId w:val="2"/>
+        </w:numPr>
+        <w:spacing w:after="80"/>
+      </w:pPr>
+      <w:r>
+        <w:rPr>
+          <w:rFonts w:ascii="Arial" w:cs="Arial" w:eastAsia="Arial" w:hAnsi="Arial"/>
+          <w:sz w:val="22"/>
+          <w:szCs w:val="22"/>
+        </w:rPr>
+        <w:t xml:space="preserve">Units also auto-discover each other for two-way CW — header shows DUAL when paired</w:t>
+      </w:r>
+    </w:p>
+    <w:p>
+      <w:pPr>
+        <w:pStyle w:val="ListParagraph"/>
+        <w:numPr>
+          <w:ilvl w:val="0"/>
+          <w:numId w:val="2"/>
+        </w:numPr>
+        <w:spacing w:after="80"/>
+      </w:pPr>
+      <w:r>
+        <w:rPr>
+          <w:rFonts w:ascii="Arial" w:cs="Arial" w:eastAsia="Arial" w:hAnsi="Arial"/>
+          <w:sz w:val="22"/>
+          <w:szCs w:val="22"/>
+        </w:rPr>
+        <w:t xml:space="preserve">SOLO = no peer found yet, DUAL = paired and ready</w:t>
       </w:r>
     </w:p>
     <w:p>
@@ -5048,7 +5351,7 @@
                 <w:sz w:val="20"/>
                 <w:szCs w:val="20"/>
               </w:rPr>
-              <w:t xml:space="preserve">Word gap</w:t>
+              <w:t xml:space="preserve">Word gap (ITU)</w:t>
             </w:r>
           </w:p>
         </w:tc>
@@ -5312,7 +5615,7 @@
                 <w:sz w:val="20"/>
                 <w:szCs w:val="20"/>
               </w:rPr>
-              <w:t xml:space="preserve">Sidetone Frequency</w:t>
+              <w:t xml:space="preserve">Farnsworth</w:t>
             </w:r>
           </w:p>
         </w:tc>
@@ -5343,7 +5646,7 @@
                 <w:sz w:val="20"/>
                 <w:szCs w:val="20"/>
               </w:rPr>
-              <w:t xml:space="preserve">700 Hz</w:t>
+              <w:t xml:space="preserve">Off (equal to char speed)</w:t>
             </w:r>
           </w:p>
         </w:tc>
@@ -5376,7 +5679,7 @@
                 <w:sz w:val="20"/>
                 <w:szCs w:val="20"/>
               </w:rPr>
-              <w:t xml:space="preserve">Head Copy Delay</w:t>
+              <w:t xml:space="preserve">Sidetone Frequency</w:t>
             </w:r>
           </w:p>
         </w:tc>
@@ -5407,7 +5710,7 @@
                 <w:sz w:val="20"/>
                 <w:szCs w:val="20"/>
               </w:rPr>
-              <w:t xml:space="preserve">0.0 seconds (off)</w:t>
+              <w:t xml:space="preserve">700 Hz</w:t>
             </w:r>
           </w:p>
         </w:tc>
@@ -5440,7 +5743,7 @@
                 <w:sz w:val="20"/>
                 <w:szCs w:val="20"/>
               </w:rPr>
-              <w:t xml:space="preserve">Volume</w:t>
+              <w:t xml:space="preserve">Head Copy Delay</w:t>
             </w:r>
           </w:p>
         </w:tc>
@@ -5471,7 +5774,7 @@
                 <w:sz w:val="20"/>
                 <w:szCs w:val="20"/>
               </w:rPr>
-              <w:t xml:space="preserve">50%</w:t>
+              <w:t xml:space="preserve">0.0 seconds (off)</w:t>
             </w:r>
           </w:p>
         </w:tc>
@@ -5504,7 +5807,7 @@
                 <w:sz w:val="20"/>
                 <w:szCs w:val="20"/>
               </w:rPr>
-              <w:t xml:space="preserve">Key Mode</w:t>
+              <w:t xml:space="preserve">Volume</w:t>
             </w:r>
           </w:p>
         </w:tc>
@@ -5535,7 +5838,7 @@
                 <w:sz w:val="20"/>
                 <w:szCs w:val="20"/>
               </w:rPr>
-              <w:t xml:space="preserve">Iambic (hardware switch)</w:t>
+              <w:t xml:space="preserve">50%</w:t>
             </w:r>
           </w:p>
         </w:tc>
@@ -5568,7 +5871,7 @@
                 <w:sz w:val="20"/>
                 <w:szCs w:val="20"/>
               </w:rPr>
-              <w:t xml:space="preserve">Paddle Reverse</w:t>
+              <w:t xml:space="preserve">Word Gap</w:t>
             </w:r>
           </w:p>
         </w:tc>
@@ -5599,7 +5902,7 @@
                 <w:sz w:val="20"/>
                 <w:szCs w:val="20"/>
               </w:rPr>
-              <w:t xml:space="preserve">Normal (unreversed)</w:t>
+              <w:t xml:space="preserve">OFF</w:t>
             </w:r>
           </w:p>
         </w:tc>
@@ -5632,6 +5935,134 @@
                 <w:sz w:val="20"/>
                 <w:szCs w:val="20"/>
               </w:rPr>
+              <w:t xml:space="preserve">Key Mode</w:t>
+            </w:r>
+          </w:p>
+        </w:tc>
+        <w:tc>
+          <w:tcPr>
+            <w:tcW w:type="dxa" w:w="6360"/>
+            <w:tcBorders>
+              <w:top w:val="single" w:color="CCCCCC" w:sz="1"/>
+              <w:left w:val="single" w:color="CCCCCC" w:sz="1"/>
+              <w:bottom w:val="single" w:color="CCCCCC" w:sz="1"/>
+              <w:right w:val="single" w:color="CCCCCC" w:sz="1"/>
+            </w:tcBorders>
+            <w:shd w:fill="F9F9F9" w:val="clear"/>
+            <w:tcMar>
+              <w:top w:type="dxa" w:w="80"/>
+              <w:left w:type="dxa" w:w="120"/>
+              <w:bottom w:type="dxa" w:w="80"/>
+              <w:right w:type="dxa" w:w="120"/>
+            </w:tcMar>
+          </w:tcPr>
+          <w:p>
+            <w:r>
+              <w:rPr>
+                <w:rFonts w:ascii="Arial" w:cs="Arial" w:eastAsia="Arial" w:hAnsi="Arial"/>
+                <w:b w:val="false"/>
+                <w:bCs w:val="false"/>
+                <w:color w:val="333333"/>
+                <w:sz w:val="20"/>
+                <w:szCs w:val="20"/>
+              </w:rPr>
+              <w:t xml:space="preserve">Iambic (hardware switch)</w:t>
+            </w:r>
+          </w:p>
+        </w:tc>
+      </w:tr>
+      <w:tr>
+        <w:tc>
+          <w:tcPr>
+            <w:tcW w:type="dxa" w:w="3000"/>
+            <w:tcBorders>
+              <w:top w:val="single" w:color="CCCCCC" w:sz="1"/>
+              <w:left w:val="single" w:color="CCCCCC" w:sz="1"/>
+              <w:bottom w:val="single" w:color="CCCCCC" w:sz="1"/>
+              <w:right w:val="single" w:color="CCCCCC" w:sz="1"/>
+            </w:tcBorders>
+            <w:shd w:fill="F9F9F9" w:val="clear"/>
+            <w:tcMar>
+              <w:top w:type="dxa" w:w="80"/>
+              <w:left w:type="dxa" w:w="120"/>
+              <w:bottom w:type="dxa" w:w="80"/>
+              <w:right w:type="dxa" w:w="120"/>
+            </w:tcMar>
+          </w:tcPr>
+          <w:p>
+            <w:r>
+              <w:rPr>
+                <w:rFonts w:ascii="Arial" w:cs="Arial" w:eastAsia="Arial" w:hAnsi="Arial"/>
+                <w:b w:val="false"/>
+                <w:bCs w:val="false"/>
+                <w:color w:val="333333"/>
+                <w:sz w:val="20"/>
+                <w:szCs w:val="20"/>
+              </w:rPr>
+              <w:t xml:space="preserve">Paddle Reverse</w:t>
+            </w:r>
+          </w:p>
+        </w:tc>
+        <w:tc>
+          <w:tcPr>
+            <w:tcW w:type="dxa" w:w="6360"/>
+            <w:tcBorders>
+              <w:top w:val="single" w:color="CCCCCC" w:sz="1"/>
+              <w:left w:val="single" w:color="CCCCCC" w:sz="1"/>
+              <w:bottom w:val="single" w:color="CCCCCC" w:sz="1"/>
+              <w:right w:val="single" w:color="CCCCCC" w:sz="1"/>
+            </w:tcBorders>
+            <w:shd w:fill="F9F9F9" w:val="clear"/>
+            <w:tcMar>
+              <w:top w:type="dxa" w:w="80"/>
+              <w:left w:type="dxa" w:w="120"/>
+              <w:bottom w:type="dxa" w:w="80"/>
+              <w:right w:type="dxa" w:w="120"/>
+            </w:tcMar>
+          </w:tcPr>
+          <w:p>
+            <w:r>
+              <w:rPr>
+                <w:rFonts w:ascii="Arial" w:cs="Arial" w:eastAsia="Arial" w:hAnsi="Arial"/>
+                <w:b w:val="false"/>
+                <w:bCs w:val="false"/>
+                <w:color w:val="333333"/>
+                <w:sz w:val="20"/>
+                <w:szCs w:val="20"/>
+              </w:rPr>
+              <w:t xml:space="preserve">Normal (unreversed)</w:t>
+            </w:r>
+          </w:p>
+        </w:tc>
+      </w:tr>
+      <w:tr>
+        <w:tc>
+          <w:tcPr>
+            <w:tcW w:type="dxa" w:w="3000"/>
+            <w:tcBorders>
+              <w:top w:val="single" w:color="CCCCCC" w:sz="1"/>
+              <w:left w:val="single" w:color="CCCCCC" w:sz="1"/>
+              <w:bottom w:val="single" w:color="CCCCCC" w:sz="1"/>
+              <w:right w:val="single" w:color="CCCCCC" w:sz="1"/>
+            </w:tcBorders>
+            <w:shd w:fill="F9F9F9" w:val="clear"/>
+            <w:tcMar>
+              <w:top w:type="dxa" w:w="80"/>
+              <w:left w:type="dxa" w:w="120"/>
+              <w:bottom w:type="dxa" w:w="80"/>
+              <w:right w:type="dxa" w:w="120"/>
+            </w:tcMar>
+          </w:tcPr>
+          <w:p>
+            <w:r>
+              <w:rPr>
+                <w:rFonts w:ascii="Arial" w:cs="Arial" w:eastAsia="Arial" w:hAnsi="Arial"/>
+                <w:b w:val="false"/>
+                <w:bCs w:val="false"/>
+                <w:color w:val="333333"/>
+                <w:sz w:val="20"/>
+                <w:szCs w:val="20"/>
+              </w:rPr>
               <w:t xml:space="preserve">WiFi Channel</w:t>
             </w:r>
           </w:p>
@@ -5664,6 +6095,70 @@
                 <w:szCs w:val="20"/>
               </w:rPr>
               <w:t xml:space="preserve">Channel 1</w:t>
+            </w:r>
+          </w:p>
+        </w:tc>
+      </w:tr>
+      <w:tr>
+        <w:tc>
+          <w:tcPr>
+            <w:tcW w:type="dxa" w:w="3000"/>
+            <w:tcBorders>
+              <w:top w:val="single" w:color="CCCCCC" w:sz="1"/>
+              <w:left w:val="single" w:color="CCCCCC" w:sz="1"/>
+              <w:bottom w:val="single" w:color="CCCCCC" w:sz="1"/>
+              <w:right w:val="single" w:color="CCCCCC" w:sz="1"/>
+            </w:tcBorders>
+            <w:shd w:fill="F9F9F9" w:val="clear"/>
+            <w:tcMar>
+              <w:top w:type="dxa" w:w="80"/>
+              <w:left w:type="dxa" w:w="120"/>
+              <w:bottom w:type="dxa" w:w="80"/>
+              <w:right w:type="dxa" w:w="120"/>
+            </w:tcMar>
+          </w:tcPr>
+          <w:p>
+            <w:r>
+              <w:rPr>
+                <w:rFonts w:ascii="Arial" w:cs="Arial" w:eastAsia="Arial" w:hAnsi="Arial"/>
+                <w:b w:val="false"/>
+                <w:bCs w:val="false"/>
+                <w:color w:val="333333"/>
+                <w:sz w:val="20"/>
+                <w:szCs w:val="20"/>
+              </w:rPr>
+              <w:t xml:space="preserve">AP SSID</w:t>
+            </w:r>
+          </w:p>
+        </w:tc>
+        <w:tc>
+          <w:tcPr>
+            <w:tcW w:type="dxa" w:w="6360"/>
+            <w:tcBorders>
+              <w:top w:val="single" w:color="CCCCCC" w:sz="1"/>
+              <w:left w:val="single" w:color="CCCCCC" w:sz="1"/>
+              <w:bottom w:val="single" w:color="CCCCCC" w:sz="1"/>
+              <w:right w:val="single" w:color="CCCCCC" w:sz="1"/>
+            </w:tcBorders>
+            <w:shd w:fill="F9F9F9" w:val="clear"/>
+            <w:tcMar>
+              <w:top w:type="dxa" w:w="80"/>
+              <w:left w:type="dxa" w:w="120"/>
+              <w:bottom w:type="dxa" w:w="80"/>
+              <w:right w:type="dxa" w:w="120"/>
+            </w:tcMar>
+          </w:tcPr>
+          <w:p>
+            <w:r>
+              <w:rPr>
+                <w:rFonts w:ascii="Arial" w:cs="Arial" w:eastAsia="Arial" w:hAnsi="Arial"/>
+                <w:b w:val="false"/>
+                <w:bCs w:val="false"/>
+                <w:color w:val="333333"/>
+                <w:sz w:val="20"/>
+                <w:szCs w:val="20"/>
+              </w:rPr>
+              <w:t xml:space="preserve">K0WLY-XXXX (unique per unit)</w:t>
             </w:r>
           </w:p>
         </w:tc>
@@ -5929,7 +6424,7 @@
                 <w:sz w:val="20"/>
                 <w:szCs w:val="20"/>
               </w:rPr>
-              <w:t xml:space="preserve">Display Driver</w:t>
+              <w:t xml:space="preserve">Board Definition</w:t>
             </w:r>
           </w:p>
         </w:tc>
@@ -5960,7 +6455,7 @@
                 <w:sz w:val="20"/>
                 <w:szCs w:val="20"/>
               </w:rPr>
-              <w:t xml:space="preserve">RM67162 AMOLED, 536×240, QSPI</w:t>
+              <w:t xml:space="preserve">lilygo-t-amoled (custom boards/ folder)</w:t>
             </w:r>
           </w:p>
         </w:tc>
@@ -5993,7 +6488,7 @@
                 <w:sz w:val="20"/>
                 <w:szCs w:val="20"/>
               </w:rPr>
-              <w:t xml:space="preserve">Display Library</w:t>
+              <w:t xml:space="preserve">Display Driver</w:t>
             </w:r>
           </w:p>
         </w:tc>
@@ -6024,7 +6519,7 @@
                 <w:sz w:val="20"/>
                 <w:szCs w:val="20"/>
               </w:rPr>
-              <w:t xml:space="preserve">LilyGo-AMOLED-Series v1.2.4</w:t>
+              <w:t xml:space="preserve">RM67162 AMOLED, 536×240, QSPI</w:t>
             </w:r>
           </w:p>
         </w:tc>
@@ -6057,7 +6552,7 @@
                 <w:sz w:val="20"/>
                 <w:szCs w:val="20"/>
               </w:rPr>
-              <w:t xml:space="preserve">WiFi Protocol</w:t>
+              <w:t xml:space="preserve">WiFi Mode</w:t>
             </w:r>
           </w:p>
         </w:tc>
@@ -6088,7 +6583,7 @@
                 <w:sz w:val="20"/>
                 <w:szCs w:val="20"/>
               </w:rPr>
-              <w:t xml:space="preserve">ESP-NOW (peer-to-peer, no router)</w:t>
+              <w:t xml:space="preserve">AP+STA simultaneous</w:t>
             </w:r>
           </w:p>
         </w:tc>
@@ -6121,7 +6616,7 @@
                 <w:sz w:val="20"/>
                 <w:szCs w:val="20"/>
               </w:rPr>
-              <w:t xml:space="preserve">Keyer Task</w:t>
+              <w:t xml:space="preserve">WiFi Protocol</w:t>
             </w:r>
           </w:p>
         </w:tc>
@@ -6152,7 +6647,7 @@
                 <w:sz w:val="20"/>
                 <w:szCs w:val="20"/>
               </w:rPr>
-              <w:t xml:space="preserve">FreeRTOS task pinned to Core 1</w:t>
+              <w:t xml:space="preserve">ESP-NOW (peer-to-peer) + AsyncWebServer (AP)</w:t>
             </w:r>
           </w:p>
         </w:tc>
@@ -6185,7 +6680,135 @@
                 <w:sz w:val="20"/>
                 <w:szCs w:val="20"/>
               </w:rPr>
-              <w:t xml:space="preserve">WiFi / Display</w:t>
+              <w:t xml:space="preserve">File Storage</w:t>
+            </w:r>
+          </w:p>
+        </w:tc>
+        <w:tc>
+          <w:tcPr>
+            <w:tcW w:type="dxa" w:w="6360"/>
+            <w:tcBorders>
+              <w:top w:val="single" w:color="CCCCCC" w:sz="1"/>
+              <w:left w:val="single" w:color="CCCCCC" w:sz="1"/>
+              <w:bottom w:val="single" w:color="CCCCCC" w:sz="1"/>
+              <w:right w:val="single" w:color="CCCCCC" w:sz="1"/>
+            </w:tcBorders>
+            <w:shd w:fill="F9F9F9" w:val="clear"/>
+            <w:tcMar>
+              <w:top w:type="dxa" w:w="80"/>
+              <w:left w:type="dxa" w:w="120"/>
+              <w:bottom w:type="dxa" w:w="80"/>
+              <w:right w:type="dxa" w:w="120"/>
+            </w:tcMar>
+          </w:tcPr>
+          <w:p>
+            <w:r>
+              <w:rPr>
+                <w:rFonts w:ascii="Arial" w:cs="Arial" w:eastAsia="Arial" w:hAnsi="Arial"/>
+                <w:b w:val="false"/>
+                <w:bCs w:val="false"/>
+                <w:color w:val="333333"/>
+                <w:sz w:val="20"/>
+                <w:szCs w:val="20"/>
+              </w:rPr>
+              <w:t xml:space="preserve">LittleFS on internal flash</w:t>
+            </w:r>
+          </w:p>
+        </w:tc>
+      </w:tr>
+      <w:tr>
+        <w:tc>
+          <w:tcPr>
+            <w:tcW w:type="dxa" w:w="3000"/>
+            <w:tcBorders>
+              <w:top w:val="single" w:color="CCCCCC" w:sz="1"/>
+              <w:left w:val="single" w:color="CCCCCC" w:sz="1"/>
+              <w:bottom w:val="single" w:color="CCCCCC" w:sz="1"/>
+              <w:right w:val="single" w:color="CCCCCC" w:sz="1"/>
+            </w:tcBorders>
+            <w:shd w:fill="F9F9F9" w:val="clear"/>
+            <w:tcMar>
+              <w:top w:type="dxa" w:w="80"/>
+              <w:left w:type="dxa" w:w="120"/>
+              <w:bottom w:type="dxa" w:w="80"/>
+              <w:right w:type="dxa" w:w="120"/>
+            </w:tcMar>
+          </w:tcPr>
+          <w:p>
+            <w:r>
+              <w:rPr>
+                <w:rFonts w:ascii="Arial" w:cs="Arial" w:eastAsia="Arial" w:hAnsi="Arial"/>
+                <w:b w:val="false"/>
+                <w:bCs w:val="false"/>
+                <w:color w:val="333333"/>
+                <w:sz w:val="20"/>
+                <w:szCs w:val="20"/>
+              </w:rPr>
+              <w:t xml:space="preserve">Keyer Task</w:t>
+            </w:r>
+          </w:p>
+        </w:tc>
+        <w:tc>
+          <w:tcPr>
+            <w:tcW w:type="dxa" w:w="6360"/>
+            <w:tcBorders>
+              <w:top w:val="single" w:color="CCCCCC" w:sz="1"/>
+              <w:left w:val="single" w:color="CCCCCC" w:sz="1"/>
+              <w:bottom w:val="single" w:color="CCCCCC" w:sz="1"/>
+              <w:right w:val="single" w:color="CCCCCC" w:sz="1"/>
+            </w:tcBorders>
+            <w:shd w:fill="F9F9F9" w:val="clear"/>
+            <w:tcMar>
+              <w:top w:type="dxa" w:w="80"/>
+              <w:left w:type="dxa" w:w="120"/>
+              <w:bottom w:type="dxa" w:w="80"/>
+              <w:right w:type="dxa" w:w="120"/>
+            </w:tcMar>
+          </w:tcPr>
+          <w:p>
+            <w:r>
+              <w:rPr>
+                <w:rFonts w:ascii="Arial" w:cs="Arial" w:eastAsia="Arial" w:hAnsi="Arial"/>
+                <w:b w:val="false"/>
+                <w:bCs w:val="false"/>
+                <w:color w:val="333333"/>
+                <w:sz w:val="20"/>
+                <w:szCs w:val="20"/>
+              </w:rPr>
+              <w:t xml:space="preserve">FreeRTOS task pinned to Core 1</w:t>
+            </w:r>
+          </w:p>
+        </w:tc>
+      </w:tr>
+      <w:tr>
+        <w:tc>
+          <w:tcPr>
+            <w:tcW w:type="dxa" w:w="3000"/>
+            <w:tcBorders>
+              <w:top w:val="single" w:color="CCCCCC" w:sz="1"/>
+              <w:left w:val="single" w:color="CCCCCC" w:sz="1"/>
+              <w:bottom w:val="single" w:color="CCCCCC" w:sz="1"/>
+              <w:right w:val="single" w:color="CCCCCC" w:sz="1"/>
+            </w:tcBorders>
+            <w:shd w:fill="F9F9F9" w:val="clear"/>
+            <w:tcMar>
+              <w:top w:type="dxa" w:w="80"/>
+              <w:left w:type="dxa" w:w="120"/>
+              <w:bottom w:type="dxa" w:w="80"/>
+              <w:right w:type="dxa" w:w="120"/>
+            </w:tcMar>
+          </w:tcPr>
+          <w:p>
+            <w:r>
+              <w:rPr>
+                <w:rFonts w:ascii="Arial" w:cs="Arial" w:eastAsia="Arial" w:hAnsi="Arial"/>
+                <w:b w:val="false"/>
+                <w:bCs w:val="false"/>
+                <w:color w:val="333333"/>
+                <w:sz w:val="20"/>
+                <w:szCs w:val="20"/>
+              </w:rPr>
+              <w:t xml:space="preserve">WiFi / Display / Web</w:t>
             </w:r>
           </w:p>
         </w:tc>
@@ -6768,7 +7391,7 @@
                 <w:sz w:val="20"/>
                 <w:szCs w:val="20"/>
               </w:rPr>
-              <w:t xml:space="preserve">Check USB, try BOOT button to reflash</w:t>
+              <w:t xml:space="preserve">Check USB, hold BOOT then RST to reflash</w:t>
             </w:r>
           </w:p>
         </w:tc>
@@ -6863,7 +7486,7 @@
                 <w:sz w:val="20"/>
                 <w:szCs w:val="20"/>
               </w:rPr>
-              <w:t xml:space="preserve">Keep units within WiFi range, both on channel 1</w:t>
+              <w:t xml:space="preserve">Keep units within WiFi range</w:t>
             </w:r>
           </w:p>
         </w:tc>
@@ -7086,7 +7709,7 @@
                 <w:sz w:val="20"/>
                 <w:szCs w:val="20"/>
               </w:rPr>
-              <w:t xml:space="preserve">Settings reset</w:t>
+              <w:t xml:space="preserve">No sound to speaker</w:t>
             </w:r>
           </w:p>
         </w:tc>
@@ -7117,7 +7740,7 @@
                 <w:sz w:val="20"/>
                 <w:szCs w:val="20"/>
               </w:rPr>
-              <w:t xml:space="preserve">NVS issue</w:t>
+              <w:t xml:space="preserve">Coupling cap in circuit</w:t>
             </w:r>
           </w:p>
         </w:tc>
@@ -7148,7 +7771,7 @@
                 <w:sz w:val="20"/>
                 <w:szCs w:val="20"/>
               </w:rPr>
-              <w:t xml:space="preserve">Exit edit mode after adjusting</w:t>
+              <w:t xml:space="preserve">Remove cap — speaker is direct connection</w:t>
             </w:r>
           </w:p>
         </w:tc>
@@ -7181,7 +7804,7 @@
                 <w:sz w:val="20"/>
                 <w:szCs w:val="20"/>
               </w:rPr>
-              <w:t xml:space="preserve">No sound to speaker</w:t>
+              <w:t xml:space="preserve">No key output</w:t>
             </w:r>
           </w:p>
         </w:tc>
@@ -7212,7 +7835,7 @@
                 <w:sz w:val="20"/>
                 <w:szCs w:val="20"/>
               </w:rPr>
-              <w:t xml:space="preserve">Coupling cap in circuit</w:t>
+              <w:t xml:space="preserve">PC817 circuit issue</w:t>
             </w:r>
           </w:p>
         </w:tc>
@@ -7243,7 +7866,7 @@
                 <w:sz w:val="20"/>
                 <w:szCs w:val="20"/>
               </w:rPr>
-              <w:t xml:space="preserve">Remove cap — speaker is direct connection</w:t>
+              <w:t xml:space="preserve">Check optocoupler wiring and GPIO12</w:t>
             </w:r>
           </w:p>
         </w:tc>
@@ -7276,7 +7899,7 @@
                 <w:sz w:val="20"/>
                 <w:szCs w:val="20"/>
               </w:rPr>
-              <w:t xml:space="preserve">No key output to radio</w:t>
+              <w:t xml:space="preserve">K0WLY-XXXX not visible</w:t>
             </w:r>
           </w:p>
         </w:tc>
@@ -7307,7 +7930,7 @@
                 <w:sz w:val="20"/>
                 <w:szCs w:val="20"/>
               </w:rPr>
-              <w:t xml:space="preserve">PC817 circuit issue</w:t>
+              <w:t xml:space="preserve">AP not started</w:t>
             </w:r>
           </w:p>
         </w:tc>
@@ -7338,7 +7961,7 @@
                 <w:sz w:val="20"/>
                 <w:szCs w:val="20"/>
               </w:rPr>
-              <w:t xml:space="preserve">Check optocoupler wiring and GPIO12</w:t>
+              <w:t xml:space="preserve">Check serial monitor for AP IP output</w:t>
             </w:r>
           </w:p>
         </w:tc>
@@ -7371,7 +7994,7 @@
                 <w:sz w:val="20"/>
                 <w:szCs w:val="20"/>
               </w:rPr>
-              <w:t xml:space="preserve">Radio keys constantly</w:t>
+              <w:t xml:space="preserve">Can't connect to AP</w:t>
             </w:r>
           </w:p>
         </w:tc>
@@ -7402,7 +8025,7 @@
                 <w:sz w:val="20"/>
                 <w:szCs w:val="20"/>
               </w:rPr>
-              <w:t xml:space="preserve">GPIO12 stuck HIGH</w:t>
+              <w:t xml:space="preserve">Android blocking</w:t>
             </w:r>
           </w:p>
         </w:tc>
@@ -7433,7 +8056,197 @@
                 <w:sz w:val="20"/>
                 <w:szCs w:val="20"/>
               </w:rPr>
-              <w:t xml:space="preserve">Check firmware and GPIO12 wiring</w:t>
+              <w:t xml:space="preserve">Turn off Avoid Bad Connections in WiFi settings</w:t>
+            </w:r>
+          </w:p>
+        </w:tc>
+      </w:tr>
+      <w:tr>
+        <w:tc>
+          <w:tcPr>
+            <w:tcW w:type="dxa" w:w="3120"/>
+            <w:tcBorders>
+              <w:top w:val="single" w:color="CCCCCC" w:sz="1"/>
+              <w:left w:val="single" w:color="CCCCCC" w:sz="1"/>
+              <w:bottom w:val="single" w:color="CCCCCC" w:sz="1"/>
+              <w:right w:val="single" w:color="CCCCCC" w:sz="1"/>
+            </w:tcBorders>
+            <w:shd w:fill="F5F5F5" w:val="clear"/>
+            <w:tcMar>
+              <w:top w:type="dxa" w:w="80"/>
+              <w:left w:type="dxa" w:w="120"/>
+              <w:bottom w:type="dxa" w:w="80"/>
+              <w:right w:type="dxa" w:w="120"/>
+            </w:tcMar>
+          </w:tcPr>
+          <w:p>
+            <w:r>
+              <w:rPr>
+                <w:rFonts w:ascii="Arial" w:cs="Arial" w:eastAsia="Arial" w:hAnsi="Arial"/>
+                <w:b w:val="false"/>
+                <w:bCs w:val="false"/>
+                <w:color w:val="333333"/>
+                <w:sz w:val="20"/>
+                <w:szCs w:val="20"/>
+              </w:rPr>
+              <w:t xml:space="preserve">Files not showing</w:t>
+            </w:r>
+          </w:p>
+        </w:tc>
+        <w:tc>
+          <w:tcPr>
+            <w:tcW w:type="dxa" w:w="3120"/>
+            <w:tcBorders>
+              <w:top w:val="single" w:color="CCCCCC" w:sz="1"/>
+              <w:left w:val="single" w:color="CCCCCC" w:sz="1"/>
+              <w:bottom w:val="single" w:color="CCCCCC" w:sz="1"/>
+              <w:right w:val="single" w:color="CCCCCC" w:sz="1"/>
+            </w:tcBorders>
+            <w:shd w:fill="F5F5F5" w:val="clear"/>
+            <w:tcMar>
+              <w:top w:type="dxa" w:w="80"/>
+              <w:left w:type="dxa" w:w="120"/>
+              <w:bottom w:type="dxa" w:w="80"/>
+              <w:right w:type="dxa" w:w="120"/>
+            </w:tcMar>
+          </w:tcPr>
+          <w:p>
+            <w:r>
+              <w:rPr>
+                <w:rFonts w:ascii="Arial" w:cs="Arial" w:eastAsia="Arial" w:hAnsi="Arial"/>
+                <w:b w:val="false"/>
+                <w:bCs w:val="false"/>
+                <w:color w:val="333333"/>
+                <w:sz w:val="20"/>
+                <w:szCs w:val="20"/>
+              </w:rPr>
+              <w:t xml:space="preserve">LittleFS not mounted</w:t>
+            </w:r>
+          </w:p>
+        </w:tc>
+        <w:tc>
+          <w:tcPr>
+            <w:tcW w:type="dxa" w:w="3120"/>
+            <w:tcBorders>
+              <w:top w:val="single" w:color="CCCCCC" w:sz="1"/>
+              <w:left w:val="single" w:color="CCCCCC" w:sz="1"/>
+              <w:bottom w:val="single" w:color="CCCCCC" w:sz="1"/>
+              <w:right w:val="single" w:color="CCCCCC" w:sz="1"/>
+            </w:tcBorders>
+            <w:shd w:fill="F5F5F5" w:val="clear"/>
+            <w:tcMar>
+              <w:top w:type="dxa" w:w="80"/>
+              <w:left w:type="dxa" w:w="120"/>
+              <w:bottom w:type="dxa" w:w="80"/>
+              <w:right w:type="dxa" w:w="120"/>
+            </w:tcMar>
+          </w:tcPr>
+          <w:p>
+            <w:r>
+              <w:rPr>
+                <w:rFonts w:ascii="Arial" w:cs="Arial" w:eastAsia="Arial" w:hAnsi="Arial"/>
+                <w:b w:val="false"/>
+                <w:bCs w:val="false"/>
+                <w:color w:val="333333"/>
+                <w:sz w:val="20"/>
+                <w:szCs w:val="20"/>
+              </w:rPr>
+              <w:t xml:space="preserve">Reflash with correct board definition</w:t>
+            </w:r>
+          </w:p>
+        </w:tc>
+      </w:tr>
+      <w:tr>
+        <w:tc>
+          <w:tcPr>
+            <w:tcW w:type="dxa" w:w="3120"/>
+            <w:tcBorders>
+              <w:top w:val="single" w:color="CCCCCC" w:sz="1"/>
+              <w:left w:val="single" w:color="CCCCCC" w:sz="1"/>
+              <w:bottom w:val="single" w:color="CCCCCC" w:sz="1"/>
+              <w:right w:val="single" w:color="CCCCCC" w:sz="1"/>
+            </w:tcBorders>
+            <w:shd w:fill="F5F5F5" w:val="clear"/>
+            <w:tcMar>
+              <w:top w:type="dxa" w:w="80"/>
+              <w:left w:type="dxa" w:w="120"/>
+              <w:bottom w:type="dxa" w:w="80"/>
+              <w:right w:type="dxa" w:w="120"/>
+            </w:tcMar>
+          </w:tcPr>
+          <w:p>
+            <w:r>
+              <w:rPr>
+                <w:rFonts w:ascii="Arial" w:cs="Arial" w:eastAsia="Arial" w:hAnsi="Arial"/>
+                <w:b w:val="false"/>
+                <w:bCs w:val="false"/>
+                <w:color w:val="333333"/>
+                <w:sz w:val="20"/>
+                <w:szCs w:val="20"/>
+              </w:rPr>
+              <w:t xml:space="preserve">Spaces within words</w:t>
+            </w:r>
+          </w:p>
+        </w:tc>
+        <w:tc>
+          <w:tcPr>
+            <w:tcW w:type="dxa" w:w="3120"/>
+            <w:tcBorders>
+              <w:top w:val="single" w:color="CCCCCC" w:sz="1"/>
+              <w:left w:val="single" w:color="CCCCCC" w:sz="1"/>
+              <w:bottom w:val="single" w:color="CCCCCC" w:sz="1"/>
+              <w:right w:val="single" w:color="CCCCCC" w:sz="1"/>
+            </w:tcBorders>
+            <w:shd w:fill="F5F5F5" w:val="clear"/>
+            <w:tcMar>
+              <w:top w:type="dxa" w:w="80"/>
+              <w:left w:type="dxa" w:w="120"/>
+              <w:bottom w:type="dxa" w:w="80"/>
+              <w:right w:type="dxa" w:w="120"/>
+            </w:tcMar>
+          </w:tcPr>
+          <w:p>
+            <w:r>
+              <w:rPr>
+                <w:rFonts w:ascii="Arial" w:cs="Arial" w:eastAsia="Arial" w:hAnsi="Arial"/>
+                <w:b w:val="false"/>
+                <w:bCs w:val="false"/>
+                <w:color w:val="333333"/>
+                <w:sz w:val="20"/>
+                <w:szCs w:val="20"/>
+              </w:rPr>
+              <w:t xml:space="preserve">GAP threshold too low</w:t>
+            </w:r>
+          </w:p>
+        </w:tc>
+        <w:tc>
+          <w:tcPr>
+            <w:tcW w:type="dxa" w:w="3120"/>
+            <w:tcBorders>
+              <w:top w:val="single" w:color="CCCCCC" w:sz="1"/>
+              <w:left w:val="single" w:color="CCCCCC" w:sz="1"/>
+              <w:bottom w:val="single" w:color="CCCCCC" w:sz="1"/>
+              <w:right w:val="single" w:color="CCCCCC" w:sz="1"/>
+            </w:tcBorders>
+            <w:shd w:fill="F5F5F5" w:val="clear"/>
+            <w:tcMar>
+              <w:top w:type="dxa" w:w="80"/>
+              <w:left w:type="dxa" w:w="120"/>
+              <w:bottom w:type="dxa" w:w="80"/>
+              <w:right w:type="dxa" w:w="120"/>
+            </w:tcMar>
+          </w:tcPr>
+          <w:p>
+            <w:r>
+              <w:rPr>
+                <w:rFonts w:ascii="Arial" w:cs="Arial" w:eastAsia="Arial" w:hAnsi="Arial"/>
+                <w:b w:val="false"/>
+                <w:bCs w:val="false"/>
+                <w:color w:val="333333"/>
+                <w:sz w:val="20"/>
+                <w:szCs w:val="20"/>
+              </w:rPr>
+              <w:t xml:space="preserve">Increase GAP or set to OFF</w:t>
             </w:r>
           </w:p>
         </w:tc>
@@ -7473,7 +8286,7 @@
           <w:sz w:val="22"/>
           <w:szCs w:val="22"/>
         </w:rPr>
-        <w:t xml:space="preserve">The keyer decodes letters, numbers, punctuation, and prosigns. Prosigns: + = AR (end of message), = = BT (break), ~ = SK (end of contact).</w:t>
+        <w:t xml:space="preserve">The keyer decodes letters, numbers, punctuation, and prosigns. Prosigns: + = AR, = = BT, ~ = SK.</w:t>
       </w:r>
     </w:p>
     <w:p>
@@ -9547,7 +10360,7 @@
           <w:sz w:val="18"/>
           <w:szCs w:val="18"/>
         </w:rPr>
-        <w:t xml:space="preserve">K0WLY Two-Way CW Keyer — Preliminary Manual v1.2</w:t>
+        <w:t xml:space="preserve">K0WLY Two-Way CW Keyer — Preliminary Manual v1.3</w:t>
       </w:r>
     </w:p>
     <w:p>

</xml_diff>

<commit_message>
v1.4.3 - Add user guide, complete Morse reference, file playback improvements
</commit_message>
<xml_diff>
--- a/docs/K0WLY_CW_Keyer_Manual.docx
+++ b/docs/K0WLY_CW_Keyer_Manual.docx
@@ -63,7 +63,7 @@
           <w:sz w:val="24"/>
           <w:szCs w:val="24"/>
         </w:rPr>
-        <w:t xml:space="preserve">Version 1.4</w:t>
+        <w:t xml:space="preserve">Version 1.4.3</w:t>
       </w:r>
     </w:p>
     <w:p>
@@ -8550,9 +8550,200 @@
           <w:sz w:val="22"/>
           <w:szCs w:val="22"/>
         </w:rPr>
-        <w:t xml:space="preserve">Prosigns: + = AR (end msg), = = BT (break), ~ = SK (end QSO), &amp; = AS (wait)</w:t>
-      </w:r>
-    </w:p>
+        <w:t xml:space="preserve">Prosigns (sent as single characters):</w:t>
+      </w:r>
+    </w:p>
+    <w:tbl>
+      <w:tblPr>
+        <w:tblW w:type="dxa" w:w="9360"/>
+        <w:tblBorders>
+          <w:top w:val="single" w:color="auto" w:sz="4"/>
+          <w:left w:val="single" w:color="auto" w:sz="4"/>
+          <w:bottom w:val="single" w:color="auto" w:sz="4"/>
+          <w:right w:val="single" w:color="auto" w:sz="4"/>
+          <w:insideH w:val="single" w:color="auto" w:sz="4"/>
+          <w:insideV w:val="single" w:color="auto" w:sz="4"/>
+        </w:tblBorders>
+      </w:tblPr>
+      <w:tblGrid>
+        <w:gridCol w:w="1560"/>
+        <w:gridCol w:w="1560"/>
+        <w:gridCol w:w="1560"/>
+        <w:gridCol w:w="1560"/>
+        <w:gridCol w:w="1560"/>
+        <w:gridCol w:w="1560"/>
+      </w:tblGrid>
+      <w:tr>
+        <w:tc>
+          <w:tcPr>
+            <w:tcW w:type="dxa" w:w="1560"/>
+            <w:tcBorders>
+              <w:top w:val="single" w:color="CCCCCC" w:sz="1"/>
+              <w:left w:val="single" w:color="CCCCCC" w:sz="1"/>
+              <w:bottom w:val="single" w:color="CCCCCC" w:sz="1"/>
+              <w:right w:val="single" w:color="CCCCCC" w:sz="1"/>
+            </w:tcBorders>
+            <w:shd w:fill="E8F4F8" w:val="clear"/>
+            <w:tcMar>
+              <w:top w:type="dxa" w:w="60"/>
+              <w:left w:type="dxa" w:w="100"/>
+              <w:bottom w:type="dxa" w:w="60"/>
+              <w:right w:type="dxa" w:w="100"/>
+            </w:tcMar>
+          </w:tcPr>
+          <w:p>
+            <w:r>
+              <w:rPr>
+                <w:rFonts w:ascii="Courier New" w:cs="Courier New" w:eastAsia="Courier New" w:hAnsi="Courier New"/>
+                <w:sz w:val="20"/>
+                <w:szCs w:val="20"/>
+              </w:rPr>
+              <w:t xml:space="preserve">+ AR  ·−·−·  end msg</w:t>
+            </w:r>
+          </w:p>
+        </w:tc>
+        <w:tc>
+          <w:tcPr>
+            <w:tcW w:type="dxa" w:w="1560"/>
+            <w:tcBorders>
+              <w:top w:val="single" w:color="CCCCCC" w:sz="1"/>
+              <w:left w:val="single" w:color="CCCCCC" w:sz="1"/>
+              <w:bottom w:val="single" w:color="CCCCCC" w:sz="1"/>
+              <w:right w:val="single" w:color="CCCCCC" w:sz="1"/>
+            </w:tcBorders>
+            <w:shd w:fill="E8F4F8" w:val="clear"/>
+            <w:tcMar>
+              <w:top w:type="dxa" w:w="60"/>
+              <w:left w:type="dxa" w:w="100"/>
+              <w:bottom w:type="dxa" w:w="60"/>
+              <w:right w:type="dxa" w:w="100"/>
+            </w:tcMar>
+          </w:tcPr>
+          <w:p>
+            <w:r>
+              <w:rPr>
+                <w:rFonts w:ascii="Courier New" w:cs="Courier New" w:eastAsia="Courier New" w:hAnsi="Courier New"/>
+                <w:sz w:val="20"/>
+                <w:szCs w:val="20"/>
+              </w:rPr>
+              <w:t xml:space="preserve">= BT  −···−  break</w:t>
+            </w:r>
+          </w:p>
+        </w:tc>
+        <w:tc>
+          <w:tcPr>
+            <w:tcW w:type="dxa" w:w="1560"/>
+            <w:tcBorders>
+              <w:top w:val="single" w:color="CCCCCC" w:sz="1"/>
+              <w:left w:val="single" w:color="CCCCCC" w:sz="1"/>
+              <w:bottom w:val="single" w:color="CCCCCC" w:sz="1"/>
+              <w:right w:val="single" w:color="CCCCCC" w:sz="1"/>
+            </w:tcBorders>
+            <w:shd w:fill="E8F4F8" w:val="clear"/>
+            <w:tcMar>
+              <w:top w:type="dxa" w:w="60"/>
+              <w:left w:type="dxa" w:w="100"/>
+              <w:bottom w:type="dxa" w:w="60"/>
+              <w:right w:type="dxa" w:w="100"/>
+            </w:tcMar>
+          </w:tcPr>
+          <w:p>
+            <w:r>
+              <w:rPr>
+                <w:rFonts w:ascii="Courier New" w:cs="Courier New" w:eastAsia="Courier New" w:hAnsi="Courier New"/>
+                <w:sz w:val="20"/>
+                <w:szCs w:val="20"/>
+              </w:rPr>
+              <w:t xml:space="preserve">~ SK  ···−·−  end QSO</w:t>
+            </w:r>
+          </w:p>
+        </w:tc>
+        <w:tc>
+          <w:tcPr>
+            <w:tcW w:type="dxa" w:w="1560"/>
+            <w:tcBorders>
+              <w:top w:val="single" w:color="CCCCCC" w:sz="1"/>
+              <w:left w:val="single" w:color="CCCCCC" w:sz="1"/>
+              <w:bottom w:val="single" w:color="CCCCCC" w:sz="1"/>
+              <w:right w:val="single" w:color="CCCCCC" w:sz="1"/>
+            </w:tcBorders>
+            <w:shd w:fill="E8F4F8" w:val="clear"/>
+            <w:tcMar>
+              <w:top w:type="dxa" w:w="60"/>
+              <w:left w:type="dxa" w:w="100"/>
+              <w:bottom w:type="dxa" w:w="60"/>
+              <w:right w:type="dxa" w:w="100"/>
+            </w:tcMar>
+          </w:tcPr>
+          <w:p>
+            <w:r>
+              <w:rPr>
+                <w:rFonts w:ascii="Courier New" w:cs="Courier New" w:eastAsia="Courier New" w:hAnsi="Courier New"/>
+                <w:sz w:val="20"/>
+                <w:szCs w:val="20"/>
+              </w:rPr>
+              <w:t xml:space="preserve">&amp; AS  ·−···  wait</w:t>
+            </w:r>
+          </w:p>
+        </w:tc>
+        <w:tc>
+          <w:tcPr>
+            <w:tcW w:type="dxa" w:w="1560"/>
+            <w:tcBorders>
+              <w:top w:val="single" w:color="CCCCCC" w:sz="1"/>
+              <w:left w:val="single" w:color="CCCCCC" w:sz="1"/>
+              <w:bottom w:val="single" w:color="CCCCCC" w:sz="1"/>
+              <w:right w:val="single" w:color="CCCCCC" w:sz="1"/>
+            </w:tcBorders>
+            <w:shd w:fill="E8F4F8" w:val="clear"/>
+            <w:tcMar>
+              <w:top w:type="dxa" w:w="60"/>
+              <w:left w:type="dxa" w:w="100"/>
+              <w:bottom w:type="dxa" w:w="60"/>
+              <w:right w:type="dxa" w:w="100"/>
+            </w:tcMar>
+          </w:tcPr>
+          <w:p>
+            <w:r>
+              <w:rPr>
+                <w:rFonts w:ascii="Courier New" w:cs="Courier New" w:eastAsia="Courier New" w:hAnsi="Courier New"/>
+                <w:sz w:val="20"/>
+                <w:szCs w:val="20"/>
+              </w:rPr>
+              <w:t xml:space="preserve"/>
+            </w:r>
+          </w:p>
+        </w:tc>
+        <w:tc>
+          <w:tcPr>
+            <w:tcW w:type="dxa" w:w="1560"/>
+            <w:tcBorders>
+              <w:top w:val="single" w:color="CCCCCC" w:sz="1"/>
+              <w:left w:val="single" w:color="CCCCCC" w:sz="1"/>
+              <w:bottom w:val="single" w:color="CCCCCC" w:sz="1"/>
+              <w:right w:val="single" w:color="CCCCCC" w:sz="1"/>
+            </w:tcBorders>
+            <w:shd w:fill="E8F4F8" w:val="clear"/>
+            <w:tcMar>
+              <w:top w:type="dxa" w:w="60"/>
+              <w:left w:type="dxa" w:w="100"/>
+              <w:bottom w:type="dxa" w:w="60"/>
+              <w:right w:type="dxa" w:w="100"/>
+            </w:tcMar>
+          </w:tcPr>
+          <w:p>
+            <w:r>
+              <w:rPr>
+                <w:rFonts w:ascii="Courier New" w:cs="Courier New" w:eastAsia="Courier New" w:hAnsi="Courier New"/>
+                <w:sz w:val="20"/>
+                <w:szCs w:val="20"/>
+              </w:rPr>
+              <w:t xml:space="preserve"/>
+            </w:r>
+          </w:p>
+        </w:tc>
+      </w:tr>
+    </w:tbl>
     <w:p>
       <w:pPr>
         <w:spacing w:after="120"/>
@@ -8578,7 +8769,7 @@
           <w:sz w:val="18"/>
           <w:szCs w:val="18"/>
         </w:rPr>
-        <w:t xml:space="preserve">K0WLY Two-Way CW Keyer — Preliminary Manual v1.4</w:t>
+        <w:t xml:space="preserve">K0WLY Two-Way CW Keyer — Preliminary Manual v1.4.3.3</w:t>
       </w:r>
     </w:p>
     <w:p>

</xml_diff>